<commit_message>
conclui a minha parte do projeto
</commit_message>
<xml_diff>
--- a/Projeto B - Relatório.docx
+++ b/Projeto B - Relatório.docx
@@ -107,13 +107,6 @@
     </w:p>
     <w:p>
       <w:pPr>
-        <w:rPr>
-          <w:lang w:val="pt-PT"/>
-        </w:rPr>
-      </w:pPr>
-    </w:p>
-    <w:p>
-      <w:pPr>
         <w:pStyle w:val="Ttulo1"/>
         <w:rPr>
           <w:lang w:val="pt-PT"/>
@@ -305,6 +298,120 @@
     </w:p>
     <w:p>
       <w:pPr>
+        <w:jc w:val="both"/>
+        <w:rPr>
+          <w:lang w:val="pt-PT"/>
+        </w:rPr>
+      </w:pPr>
+      <w:r>
+        <w:rPr>
+          <w:lang w:val="pt-PT"/>
+        </w:rPr>
+        <w:t xml:space="preserve">O alvo atual foi destacado visualmente </w:t>
+      </w:r>
+      <w:r>
+        <w:rPr>
+          <w:lang w:val="pt-PT"/>
+        </w:rPr>
+        <w:t xml:space="preserve">com uma cor </w:t>
+      </w:r>
+      <w:r>
+        <w:rPr>
+          <w:lang w:val="pt-PT"/>
+        </w:rPr>
+        <w:t xml:space="preserve">verde e </w:t>
+      </w:r>
+      <w:r>
+        <w:rPr>
+          <w:lang w:val="pt-PT"/>
+        </w:rPr>
+        <w:t xml:space="preserve">foi incluído também </w:t>
+      </w:r>
+      <w:r>
+        <w:rPr>
+          <w:lang w:val="pt-PT"/>
+        </w:rPr>
+        <w:t xml:space="preserve">de um identificador numérico (“1”). </w:t>
+      </w:r>
+      <w:r>
+        <w:rPr>
+          <w:lang w:val="pt-PT"/>
+        </w:rPr>
+        <w:t>O objetivo desta alteração é</w:t>
+      </w:r>
+      <w:r>
+        <w:rPr>
+          <w:lang w:val="pt-PT"/>
+        </w:rPr>
+        <w:t xml:space="preserve"> reduzir o tempo de procura visual, permitindo que o utilizador identifique de forma imediata o alvo correto numa grelha densa de estímulos semelhantes. Ao diminuir a ambiguidade percetiva, reduz-se a carga cognitiva associada à tarefa e aumenta-se a probabilidade de uma seleção correta, contribuindo para uma maior eficácia e eficiência global da interação. Esta abordagem está alinhada com princípios </w:t>
+      </w:r>
+      <w:r>
+        <w:rPr>
+          <w:lang w:val="pt-PT"/>
+        </w:rPr>
+        <w:t xml:space="preserve">de </w:t>
+      </w:r>
+      <w:r>
+        <w:rPr>
+          <w:lang w:val="pt-PT"/>
+        </w:rPr>
+        <w:t>orientação d</w:t>
+      </w:r>
+      <w:r>
+        <w:rPr>
+          <w:lang w:val="pt-PT"/>
+        </w:rPr>
+        <w:t>e</w:t>
+      </w:r>
+      <w:r>
+        <w:rPr>
+          <w:lang w:val="pt-PT"/>
+        </w:rPr>
+        <w:t xml:space="preserve"> atenção em interfaces pessoa-máquina</w:t>
+      </w:r>
+      <w:r>
+        <w:rPr>
+          <w:lang w:val="pt-PT"/>
+        </w:rPr>
+        <w:t xml:space="preserve"> </w:t>
+      </w:r>
+      <w:r>
+        <w:rPr>
+          <w:i/>
+          <w:iCs/>
+          <w:lang w:val="pt-PT"/>
+        </w:rPr>
+        <w:t>(</w:t>
+      </w:r>
+      <w:proofErr w:type="spellStart"/>
+      <w:r>
+        <w:rPr>
+          <w:i/>
+          <w:iCs/>
+          <w:lang w:val="pt-PT"/>
+        </w:rPr>
+        <w:t>Ware</w:t>
+      </w:r>
+      <w:proofErr w:type="spellEnd"/>
+      <w:r>
+        <w:rPr>
+          <w:i/>
+          <w:iCs/>
+          <w:lang w:val="pt-PT"/>
+        </w:rPr>
+        <w:t>, 2013)</w:t>
+      </w:r>
+      <w:r>
+        <w:rPr>
+          <w:i/>
+          <w:iCs/>
+          <w:lang w:val="pt-PT"/>
+        </w:rPr>
+        <w:t>.</w:t>
+      </w:r>
+    </w:p>
+    <w:p>
+      <w:pPr>
         <w:pStyle w:val="Ttulo2"/>
         <w:rPr>
           <w:lang w:val="pt-PT"/>
@@ -345,34 +452,49 @@
     </w:p>
     <w:p>
       <w:pPr>
-        <w:rPr>
-          <w:lang w:val="pt-PT"/>
-        </w:rPr>
-      </w:pPr>
-      <w:proofErr w:type="spellStart"/>
-      <w:r>
-        <w:rPr>
-          <w:lang w:val="pt-PT"/>
-        </w:rPr>
-        <w:t>Highlight</w:t>
-      </w:r>
-      <w:proofErr w:type="spellEnd"/>
-      <w:r>
-        <w:rPr>
-          <w:lang w:val="pt-PT"/>
-        </w:rPr>
-        <w:t xml:space="preserve"> do próximo alvo em </w:t>
-      </w:r>
-      <w:proofErr w:type="spellStart"/>
-      <w:r>
-        <w:rPr>
-          <w:lang w:val="pt-PT"/>
-        </w:rPr>
-        <w:t>amerelo</w:t>
-      </w:r>
-      <w:proofErr w:type="spellEnd"/>
-      <w:r>
-        <w:rPr>
+        <w:jc w:val="both"/>
+        <w:rPr>
+          <w:i/>
+          <w:iCs/>
+          <w:lang w:val="pt-PT"/>
+        </w:rPr>
+      </w:pPr>
+      <w:r>
+        <w:rPr>
+          <w:lang w:val="pt-PT"/>
+        </w:rPr>
+        <w:t xml:space="preserve">Para além do alvo atual, o próximo alvo da sequência foi igualmente destacado, recorrendo </w:t>
+      </w:r>
+      <w:r>
+        <w:rPr>
+          <w:lang w:val="pt-PT"/>
+        </w:rPr>
+        <w:t xml:space="preserve">à cor amarela </w:t>
+      </w:r>
+      <w:r>
+        <w:rPr>
+          <w:lang w:val="pt-PT"/>
+        </w:rPr>
+        <w:t>e a um identificador numérico (“2”). Esta alteração explora explicitamente a informação antecipada disponibilizada pelo sistema, permitindo ao utilizador preparar a ação seguinte enquanto executa a atual. Desta forma, promove-se um comportamento mais fluido e contínuo, reduzindo tempos de reação entre seleções consecutivas. A antecipação visual contribui para uma diminuição do tempo total de execução da tarefa sem comprometer a precisão, sendo particularmente relevante em tarefas repetitivas e temporizadas</w:t>
+      </w:r>
+      <w:r>
+        <w:rPr>
+          <w:lang w:val="pt-PT"/>
+        </w:rPr>
+        <w:t xml:space="preserve"> </w:t>
+      </w:r>
+      <w:r>
+        <w:rPr>
+          <w:i/>
+          <w:iCs/>
+          <w:lang w:val="pt-PT"/>
+        </w:rPr>
+        <w:t>(Norman, 2013)</w:t>
+      </w:r>
+      <w:r>
+        <w:rPr>
+          <w:i/>
+          <w:iCs/>
           <w:lang w:val="pt-PT"/>
         </w:rPr>
         <w:t>.</w:t>
@@ -380,10 +502,75 @@
     </w:p>
     <w:p>
       <w:pPr>
-        <w:rPr>
-          <w:lang w:val="pt-PT"/>
-        </w:rPr>
-      </w:pPr>
+        <w:jc w:val="both"/>
+        <w:rPr>
+          <w:lang w:val="pt-PT"/>
+        </w:rPr>
+      </w:pPr>
+    </w:p>
+    <w:p>
+      <w:pPr>
+        <w:jc w:val="both"/>
+        <w:rPr>
+          <w:lang w:val="pt-PT"/>
+        </w:rPr>
+      </w:pPr>
+      <w:r>
+        <w:rPr>
+          <w:lang w:val="pt-PT"/>
+        </w:rPr>
+        <w:t xml:space="preserve">Apesar do terceiro alvo também ser disponibilizado, optamos por não o colocar. A razão por detrás desta escolha prende-se que com o facto de que, ao fazer alguns testes preliminares e observações, os 3 alvos (1, 2 e 3) estarem presentes em simultâneo </w:t>
+      </w:r>
+      <w:r>
+        <w:rPr>
+          <w:lang w:val="pt-PT"/>
+        </w:rPr>
+        <w:t xml:space="preserve">aumentava a carga cognitiva, </w:t>
+      </w:r>
+      <w:r>
+        <w:rPr>
+          <w:lang w:val="pt-PT"/>
+        </w:rPr>
+        <w:t xml:space="preserve">dificultando a identificação do alvo correto e conduzindo </w:t>
+      </w:r>
+      <w:r>
+        <w:rPr>
+          <w:lang w:val="pt-PT"/>
+        </w:rPr>
+        <w:t>a</w:t>
+      </w:r>
+      <w:r>
+        <w:rPr>
+          <w:lang w:val="pt-PT"/>
+        </w:rPr>
+        <w:t xml:space="preserve"> erros adicionais</w:t>
+      </w:r>
+      <w:r>
+        <w:rPr>
+          <w:lang w:val="pt-PT"/>
+        </w:rPr>
+        <w:t xml:space="preserve"> </w:t>
+      </w:r>
+      <w:r>
+        <w:rPr>
+          <w:lang w:val="pt-PT"/>
+        </w:rPr>
+        <w:t>(</w:t>
+      </w:r>
+      <w:proofErr w:type="spellStart"/>
+      <w:r>
+        <w:rPr>
+          <w:lang w:val="pt-PT"/>
+        </w:rPr>
+        <w:t>Sweller</w:t>
+      </w:r>
+      <w:proofErr w:type="spellEnd"/>
+      <w:r>
+        <w:rPr>
+          <w:lang w:val="pt-PT"/>
+        </w:rPr>
+        <w:t>, 1988; Norman, 2013).</w:t>
+      </w:r>
     </w:p>
     <w:p>
       <w:pPr>
@@ -428,7 +615,7 @@
         <w:rPr>
           <w:lang w:val="pt-PT"/>
         </w:rPr>
-        <w:t xml:space="preserve">A primeira alteração que fizemos foi maximizar o alvo atual. A ideia por detrás desta alteração prende-se com o facto de que, ao aumentarmos o tamanho do alvo para o tamanho máximo da célula em que se insere, dá uma margem de sucesso de 100% ao utilizador desde que ele clique em qualquer ponto dentro da célula. De um ponto de vista teórico, esta alteração representa uma aplicação prática da Lei de </w:t>
+        <w:t xml:space="preserve">O alvo atual foi aumentado para ocupar a totalidade da célula da grelha onde se insere. Esta decisão baseia-se diretamente na Lei de </w:t>
       </w:r>
       <w:proofErr w:type="spellStart"/>
       <w:r>
@@ -442,28 +629,48 @@
         <w:rPr>
           <w:lang w:val="pt-PT"/>
         </w:rPr>
-        <w:t xml:space="preserve"> (alvos maiores tendem a ser mais fáceis de clicar).</w:t>
-      </w:r>
-    </w:p>
-    <w:p>
-      <w:pPr>
-        <w:rPr>
-          <w:lang w:val="pt-PT"/>
-        </w:rPr>
-      </w:pPr>
-      <w:r>
-        <w:rPr>
-          <w:lang w:val="pt-PT"/>
-        </w:rPr>
-        <w:t>&lt;Descrição detalhada da alteração&gt;&lt;Qual o seu racional?&gt;&lt;Se possível, suportar a alteração com uma referência bibliográfica&gt;&lt;Se possível, apresentar uma ilustração/diagrama da alteração&gt;</w:t>
-      </w:r>
-    </w:p>
-    <w:p>
-      <w:pPr>
-        <w:rPr>
-          <w:lang w:val="pt-PT"/>
-        </w:rPr>
-      </w:pPr>
+        <w:t>, segundo a qual alvos maiores reduzem o tempo necessário para a sua aquisição e aumentam a probabilidade de sucesso. Ao permitir que qualquer clique dentro da célula resulte numa seleção correta, esta alteração diminui significativamente o esforço motor exigido ao utilizador e reduz erros associados à precisão do movimento do cursor, aumentando simultaneamente a eficácia e a eficiência da interação</w:t>
+      </w:r>
+      <w:r>
+        <w:rPr>
+          <w:lang w:val="pt-PT"/>
+        </w:rPr>
+        <w:t xml:space="preserve"> </w:t>
+      </w:r>
+      <w:r>
+        <w:rPr>
+          <w:i/>
+          <w:iCs/>
+          <w:lang w:val="pt-PT"/>
+        </w:rPr>
+        <w:t>(</w:t>
+      </w:r>
+      <w:proofErr w:type="spellStart"/>
+      <w:r>
+        <w:rPr>
+          <w:i/>
+          <w:iCs/>
+          <w:lang w:val="pt-PT"/>
+        </w:rPr>
+        <w:t>Fitts</w:t>
+      </w:r>
+      <w:proofErr w:type="spellEnd"/>
+      <w:r>
+        <w:rPr>
+          <w:i/>
+          <w:iCs/>
+          <w:lang w:val="pt-PT"/>
+        </w:rPr>
+        <w:t>, 1954)</w:t>
+      </w:r>
+      <w:r>
+        <w:rPr>
+          <w:i/>
+          <w:iCs/>
+          <w:lang w:val="pt-PT"/>
+        </w:rPr>
+        <w:t>.</w:t>
+      </w:r>
     </w:p>
     <w:p>
       <w:pPr>
@@ -476,7 +683,6 @@
         <w:rPr>
           <w:lang w:val="pt-PT"/>
         </w:rPr>
-        <w:lastRenderedPageBreak/>
         <w:t xml:space="preserve">Alteração </w:t>
       </w:r>
       <w:r>
@@ -500,51 +706,71 @@
     </w:p>
     <w:p>
       <w:pPr>
-        <w:rPr>
-          <w:lang w:val="pt-PT"/>
-        </w:rPr>
-      </w:pPr>
-      <w:r>
-        <w:rPr>
-          <w:lang w:val="pt-PT"/>
-        </w:rPr>
-        <w:t xml:space="preserve">A segunda alteração foi minimizar o tamanho dos alvos que não são o alvo atual (até ao limite mínimo imposto pelo enunciado). Mais uma vez, esta alteração representa uma aplicação prática da Lei de </w:t>
-      </w:r>
-      <w:proofErr w:type="spellStart"/>
-      <w:r>
-        <w:rPr>
-          <w:lang w:val="pt-PT"/>
-        </w:rPr>
-        <w:t>Fitts</w:t>
-      </w:r>
-      <w:proofErr w:type="spellEnd"/>
-      <w:r>
-        <w:rPr>
-          <w:lang w:val="pt-PT"/>
-        </w:rPr>
-        <w:t>. Na realidade, o que esta alteração faz é reduzir significativamente a margem de erro do utilizador, visto que o alvo que resultaria numa “</w:t>
-      </w:r>
-      <w:proofErr w:type="spellStart"/>
-      <w:r>
-        <w:rPr>
-          <w:lang w:val="pt-PT"/>
-        </w:rPr>
-        <w:t>failure</w:t>
-      </w:r>
-      <w:proofErr w:type="spellEnd"/>
-      <w:r>
-        <w:rPr>
-          <w:lang w:val="pt-PT"/>
-        </w:rPr>
-        <w:t>” é o mais pequeno possível. Consequentemente fazendo com que esta alteração seja</w:t>
-      </w:r>
-    </w:p>
-    <w:p>
-      <w:pPr>
-        <w:rPr>
-          <w:lang w:val="pt-PT"/>
-        </w:rPr>
-      </w:pPr>
+        <w:jc w:val="both"/>
+        <w:rPr>
+          <w:lang w:val="pt-PT"/>
+        </w:rPr>
+      </w:pPr>
+      <w:r>
+        <w:rPr>
+          <w:lang w:val="pt-PT"/>
+        </w:rPr>
+        <w:t xml:space="preserve">Os alvos que não correspondem ao alvo atual foram reduzidos ao tamanho mínimo permitido pelo enunciado (1/3 da célula). Esta alteração complementa a maximização do alvo correto, reforçando a hierarquia visual entre estímulos relevantes e irrelevantes. Ao diminuir a área clicável dos alvos incorretos, reduz-se a probabilidade de seleções erradas, o que contribui para uma diminuição do número de falhas e erros registados. Esta estratégia atua simultaneamente ao nível </w:t>
+      </w:r>
+      <w:proofErr w:type="spellStart"/>
+      <w:r>
+        <w:rPr>
+          <w:lang w:val="pt-PT"/>
+        </w:rPr>
+        <w:t>perceptivo</w:t>
+      </w:r>
+      <w:proofErr w:type="spellEnd"/>
+      <w:r>
+        <w:rPr>
+          <w:lang w:val="pt-PT"/>
+        </w:rPr>
+        <w:t xml:space="preserve"> e motor, promovendo uma interação mais controlada e precisa</w:t>
+      </w:r>
+      <w:r>
+        <w:rPr>
+          <w:lang w:val="pt-PT"/>
+        </w:rPr>
+        <w:t xml:space="preserve"> </w:t>
+      </w:r>
+      <w:r>
+        <w:rPr>
+          <w:i/>
+          <w:iCs/>
+          <w:lang w:val="pt-PT"/>
+        </w:rPr>
+        <w:t>(</w:t>
+      </w:r>
+      <w:proofErr w:type="spellStart"/>
+      <w:r>
+        <w:rPr>
+          <w:i/>
+          <w:iCs/>
+          <w:lang w:val="pt-PT"/>
+        </w:rPr>
+        <w:t>MacKenzie</w:t>
+      </w:r>
+      <w:proofErr w:type="spellEnd"/>
+      <w:r>
+        <w:rPr>
+          <w:i/>
+          <w:iCs/>
+          <w:lang w:val="pt-PT"/>
+        </w:rPr>
+        <w:t>, 1992)</w:t>
+      </w:r>
+      <w:r>
+        <w:rPr>
+          <w:i/>
+          <w:iCs/>
+          <w:lang w:val="pt-PT"/>
+        </w:rPr>
+        <w:t>.</w:t>
+      </w:r>
     </w:p>
     <w:p>
       <w:pPr>
@@ -582,37 +808,75 @@
     </w:p>
     <w:p>
       <w:pPr>
-        <w:rPr>
-          <w:lang w:val="pt-PT"/>
-        </w:rPr>
-      </w:pPr>
-      <w:r>
-        <w:rPr>
-          <w:lang w:val="pt-PT"/>
-        </w:rPr>
-        <w:t>A primeira alteração que fizemos foi tocar um tom (</w:t>
-      </w:r>
-      <w:proofErr w:type="spellStart"/>
-      <w:r>
-        <w:rPr>
-          <w:lang w:val="pt-PT"/>
-        </w:rPr>
-        <w:t>Goal</w:t>
-      </w:r>
-      <w:proofErr w:type="spellEnd"/>
-      <w:r>
-        <w:rPr>
-          <w:lang w:val="pt-PT"/>
-        </w:rPr>
-        <w:t xml:space="preserve"> Tone ou Fail Tone)</w:t>
-      </w:r>
-    </w:p>
-    <w:p>
-      <w:pPr>
-        <w:rPr>
-          <w:lang w:val="pt-PT"/>
-        </w:rPr>
-      </w:pPr>
+        <w:jc w:val="both"/>
+        <w:rPr>
+          <w:lang w:val="pt-PT"/>
+        </w:rPr>
+      </w:pPr>
+      <w:r>
+        <w:rPr>
+          <w:lang w:val="pt-PT"/>
+        </w:rPr>
+        <w:t>Foram introduzidos sinais auditivos distintos para indicar sucesso, erro e falha na seleção dos alvos. O feedback sonoro imediato permite ao utilizador confirmar o resultado da sua ação sem necessidade de recorrer exclusivamente ao canal visual, facilitando uma resposta mais rápida e intuitiva. Esta redundância modal melhora a perceção do estado do sistema e apoia a aprendizagem da tarefa, especialmente em contextos de elevada repetição, contribuindo para uma maior eficiência e para a redução de erros ao longo do tempo</w:t>
+      </w:r>
+      <w:r>
+        <w:rPr>
+          <w:lang w:val="pt-PT"/>
+        </w:rPr>
+        <w:t xml:space="preserve"> </w:t>
+      </w:r>
+      <w:r>
+        <w:rPr>
+          <w:i/>
+          <w:iCs/>
+          <w:lang w:val="pt-PT"/>
+        </w:rPr>
+        <w:t>(</w:t>
+      </w:r>
+      <w:proofErr w:type="spellStart"/>
+      <w:r>
+        <w:rPr>
+          <w:i/>
+          <w:iCs/>
+          <w:lang w:val="pt-PT"/>
+        </w:rPr>
+        <w:t>Shneiderman</w:t>
+      </w:r>
+      <w:proofErr w:type="spellEnd"/>
+      <w:r>
+        <w:rPr>
+          <w:i/>
+          <w:iCs/>
+          <w:lang w:val="pt-PT"/>
+        </w:rPr>
+        <w:t xml:space="preserve"> </w:t>
+      </w:r>
+      <w:proofErr w:type="spellStart"/>
+      <w:r>
+        <w:rPr>
+          <w:i/>
+          <w:iCs/>
+          <w:lang w:val="pt-PT"/>
+        </w:rPr>
+        <w:t>et</w:t>
+      </w:r>
+      <w:proofErr w:type="spellEnd"/>
+      <w:r>
+        <w:rPr>
+          <w:i/>
+          <w:iCs/>
+          <w:lang w:val="pt-PT"/>
+        </w:rPr>
+        <w:t xml:space="preserve"> al., 2016)</w:t>
+      </w:r>
+      <w:r>
+        <w:rPr>
+          <w:i/>
+          <w:iCs/>
+          <w:lang w:val="pt-PT"/>
+        </w:rPr>
+        <w:t>.</w:t>
+      </w:r>
     </w:p>
     <w:p>
       <w:pPr>
@@ -648,37 +912,93 @@
     </w:p>
     <w:p>
       <w:pPr>
-        <w:rPr>
-          <w:lang w:val="pt-PT"/>
-        </w:rPr>
-      </w:pPr>
-      <w:r>
-        <w:rPr>
-          <w:lang w:val="pt-PT"/>
-        </w:rPr>
-        <w:t>A primeira alteração que fizemos foi tocar um tom (</w:t>
-      </w:r>
-      <w:proofErr w:type="spellStart"/>
-      <w:r>
-        <w:rPr>
-          <w:lang w:val="pt-PT"/>
-        </w:rPr>
-        <w:t>Goal</w:t>
-      </w:r>
-      <w:proofErr w:type="spellEnd"/>
-      <w:r>
-        <w:rPr>
-          <w:lang w:val="pt-PT"/>
-        </w:rPr>
-        <w:t xml:space="preserve"> Tone ou Fail Tone)</w:t>
-      </w:r>
-    </w:p>
-    <w:p>
-      <w:pPr>
-        <w:rPr>
-          <w:lang w:val="pt-PT"/>
-        </w:rPr>
-      </w:pPr>
+        <w:jc w:val="both"/>
+        <w:rPr>
+          <w:lang w:val="pt-PT"/>
+        </w:rPr>
+      </w:pPr>
+      <w:r>
+        <w:rPr>
+          <w:lang w:val="pt-PT"/>
+        </w:rPr>
+        <w:t>O cursor foi aumentado de tamanho e teve a sua cor alterada</w:t>
+      </w:r>
+      <w:r>
+        <w:rPr>
+          <w:lang w:val="pt-PT"/>
+        </w:rPr>
+        <w:t xml:space="preserve"> para vermelho</w:t>
+      </w:r>
+      <w:r>
+        <w:rPr>
+          <w:lang w:val="pt-PT"/>
+        </w:rPr>
+        <w:t xml:space="preserve"> de forma a aumentar o contraste com a grelha e os alvos. Esta alteração visa melhorar a visibilidade do ponto de interação principal e facilitar o controlo motor durante a tarefa de seleção. Um cursor mais visível permite ao utilizador localizar rapidamente a sua posição no ecrã, reduzindo movimentos corretivos e aumentando a precisão do clique. Esta melhoria é particularmente relevante em tarefas que exigem rapidez e precisão sucessivas</w:t>
+      </w:r>
+      <w:r>
+        <w:rPr>
+          <w:lang w:val="pt-PT"/>
+        </w:rPr>
+        <w:t>, como é o caso da atividade em questão</w:t>
+      </w:r>
+      <w:r>
+        <w:rPr>
+          <w:lang w:val="pt-PT"/>
+        </w:rPr>
+        <w:t xml:space="preserve"> </w:t>
+      </w:r>
+      <w:r>
+        <w:rPr>
+          <w:i/>
+          <w:iCs/>
+          <w:lang w:val="pt-PT"/>
+        </w:rPr>
+        <w:t>(</w:t>
+      </w:r>
+      <w:proofErr w:type="spellStart"/>
+      <w:r>
+        <w:rPr>
+          <w:i/>
+          <w:iCs/>
+          <w:lang w:val="pt-PT"/>
+        </w:rPr>
+        <w:t>Cockburn</w:t>
+      </w:r>
+      <w:proofErr w:type="spellEnd"/>
+      <w:r>
+        <w:rPr>
+          <w:i/>
+          <w:iCs/>
+          <w:lang w:val="pt-PT"/>
+        </w:rPr>
+        <w:t xml:space="preserve"> </w:t>
+      </w:r>
+      <w:proofErr w:type="spellStart"/>
+      <w:r>
+        <w:rPr>
+          <w:i/>
+          <w:iCs/>
+          <w:lang w:val="pt-PT"/>
+        </w:rPr>
+        <w:t>et</w:t>
+      </w:r>
+      <w:proofErr w:type="spellEnd"/>
+      <w:r>
+        <w:rPr>
+          <w:i/>
+          <w:iCs/>
+          <w:lang w:val="pt-PT"/>
+        </w:rPr>
+        <w:t xml:space="preserve"> al., 2012)</w:t>
+      </w:r>
+      <w:r>
+        <w:rPr>
+          <w:i/>
+          <w:iCs/>
+          <w:lang w:val="pt-PT"/>
+        </w:rPr>
+        <w:t>.</w:t>
+      </w:r>
     </w:p>
     <w:p>
       <w:pPr>
@@ -723,44 +1043,211 @@
     </w:p>
     <w:p>
       <w:pPr>
-        <w:rPr>
-          <w:lang w:val="pt-PT"/>
-        </w:rPr>
-      </w:pPr>
-      <w:r>
-        <w:rPr>
-          <w:lang w:val="pt-PT"/>
-        </w:rPr>
-        <w:t>A primeira alteração que fizemos foi tocar um tom (</w:t>
-      </w:r>
-      <w:proofErr w:type="spellStart"/>
-      <w:r>
-        <w:rPr>
-          <w:lang w:val="pt-PT"/>
-        </w:rPr>
-        <w:t>Goal</w:t>
-      </w:r>
-      <w:proofErr w:type="spellEnd"/>
-      <w:r>
-        <w:rPr>
-          <w:lang w:val="pt-PT"/>
-        </w:rPr>
-        <w:t xml:space="preserve"> Tone ou Fail Tone)</w:t>
-      </w:r>
-    </w:p>
-    <w:p>
-      <w:pPr>
-        <w:rPr>
-          <w:lang w:val="pt-PT"/>
-        </w:rPr>
-      </w:pPr>
-    </w:p>
-    <w:p>
-      <w:pPr>
-        <w:rPr>
-          <w:lang w:val="pt-PT"/>
-        </w:rPr>
-      </w:pPr>
+        <w:jc w:val="both"/>
+        <w:rPr>
+          <w:lang w:val="pt-PT"/>
+        </w:rPr>
+      </w:pPr>
+      <w:r>
+        <w:rPr>
+          <w:lang w:val="pt-PT"/>
+        </w:rPr>
+        <w:t>Esta última alteração não está assente num contexto científico específico</w:t>
+      </w:r>
+      <w:r>
+        <w:rPr>
+          <w:lang w:val="pt-PT"/>
+        </w:rPr>
+        <w:t>. Foi feita devido</w:t>
+      </w:r>
+      <w:r>
+        <w:rPr>
+          <w:lang w:val="pt-PT"/>
+        </w:rPr>
+        <w:t xml:space="preserve"> </w:t>
+      </w:r>
+      <w:r>
+        <w:rPr>
+          <w:lang w:val="pt-PT"/>
+        </w:rPr>
+        <w:t>a</w:t>
+      </w:r>
+      <w:r>
+        <w:rPr>
+          <w:lang w:val="pt-PT"/>
+        </w:rPr>
+        <w:t xml:space="preserve">o </w:t>
+      </w:r>
+      <w:r>
+        <w:rPr>
+          <w:lang w:val="pt-PT"/>
+        </w:rPr>
+        <w:t xml:space="preserve">computador </w:t>
+      </w:r>
+      <w:r>
+        <w:rPr>
+          <w:lang w:val="pt-PT"/>
+        </w:rPr>
+        <w:t xml:space="preserve">usado </w:t>
+      </w:r>
+      <w:r>
+        <w:rPr>
+          <w:lang w:val="pt-PT"/>
+        </w:rPr>
+        <w:t>n</w:t>
+      </w:r>
+      <w:r>
+        <w:rPr>
+          <w:lang w:val="pt-PT"/>
+        </w:rPr>
+        <w:t>a recolha d</w:t>
+      </w:r>
+      <w:r>
+        <w:rPr>
+          <w:lang w:val="pt-PT"/>
+        </w:rPr>
+        <w:t>os</w:t>
+      </w:r>
+      <w:r>
+        <w:rPr>
+          <w:lang w:val="pt-PT"/>
+        </w:rPr>
+        <w:t xml:space="preserve"> dados</w:t>
+      </w:r>
+      <w:r>
+        <w:rPr>
+          <w:lang w:val="pt-PT"/>
+        </w:rPr>
+        <w:t>.</w:t>
+      </w:r>
+      <w:r>
+        <w:rPr>
+          <w:lang w:val="pt-PT"/>
+        </w:rPr>
+        <w:t xml:space="preserve"> Após clicar em “</w:t>
+      </w:r>
+      <w:proofErr w:type="spellStart"/>
+      <w:r>
+        <w:rPr>
+          <w:lang w:val="pt-PT"/>
+        </w:rPr>
+        <w:t>start</w:t>
+      </w:r>
+      <w:proofErr w:type="spellEnd"/>
+      <w:r>
+        <w:rPr>
+          <w:lang w:val="pt-PT"/>
+        </w:rPr>
+        <w:t>”, inicialmente, a grelha não fica completamente visível no portátil usado</w:t>
+      </w:r>
+      <w:r>
+        <w:rPr>
+          <w:lang w:val="pt-PT"/>
+        </w:rPr>
+        <w:t xml:space="preserve"> pelos participantes</w:t>
+      </w:r>
+      <w:r>
+        <w:rPr>
+          <w:lang w:val="pt-PT"/>
+        </w:rPr>
+        <w:t xml:space="preserve">, requerendo que </w:t>
+      </w:r>
+      <w:r>
+        <w:rPr>
+          <w:lang w:val="pt-PT"/>
+        </w:rPr>
+        <w:t xml:space="preserve">estes </w:t>
+      </w:r>
+      <w:r>
+        <w:rPr>
+          <w:lang w:val="pt-PT"/>
+        </w:rPr>
+        <w:t>fizesse</w:t>
+      </w:r>
+      <w:r>
+        <w:rPr>
+          <w:lang w:val="pt-PT"/>
+        </w:rPr>
+        <w:t>m</w:t>
+      </w:r>
+      <w:r>
+        <w:rPr>
+          <w:lang w:val="pt-PT"/>
+        </w:rPr>
+        <w:t xml:space="preserve"> “</w:t>
+      </w:r>
+      <w:proofErr w:type="spellStart"/>
+      <w:r>
+        <w:rPr>
+          <w:lang w:val="pt-PT"/>
+        </w:rPr>
+        <w:t>scroll</w:t>
+      </w:r>
+      <w:proofErr w:type="spellEnd"/>
+      <w:r>
+        <w:rPr>
+          <w:lang w:val="pt-PT"/>
+        </w:rPr>
+        <w:t xml:space="preserve">” para ver a grelha no seu todo. Isto resultava em tempo perdido durante a tarefa, por isso optou-se por um </w:t>
+      </w:r>
+      <w:proofErr w:type="spellStart"/>
+      <w:r>
+        <w:rPr>
+          <w:lang w:val="pt-PT"/>
+        </w:rPr>
+        <w:t>zoomout</w:t>
+      </w:r>
+      <w:proofErr w:type="spellEnd"/>
+      <w:r>
+        <w:rPr>
+          <w:lang w:val="pt-PT"/>
+        </w:rPr>
+        <w:t xml:space="preserve"> ligeiro para cerca de 90% para </w:t>
+      </w:r>
+      <w:r>
+        <w:rPr>
+          <w:lang w:val="pt-PT"/>
+        </w:rPr>
+        <w:t>evitar a necessidade de fazer</w:t>
+      </w:r>
+      <w:r>
+        <w:rPr>
+          <w:lang w:val="pt-PT"/>
+        </w:rPr>
+        <w:t xml:space="preserve"> </w:t>
+      </w:r>
+      <w:r>
+        <w:rPr>
+          <w:lang w:val="pt-PT"/>
+        </w:rPr>
+        <w:t>“</w:t>
+      </w:r>
+      <w:proofErr w:type="spellStart"/>
+      <w:r>
+        <w:rPr>
+          <w:lang w:val="pt-PT"/>
+        </w:rPr>
+        <w:t>scroll</w:t>
+      </w:r>
+      <w:proofErr w:type="spellEnd"/>
+      <w:r>
+        <w:rPr>
+          <w:lang w:val="pt-PT"/>
+        </w:rPr>
+        <w:t>”</w:t>
+      </w:r>
+      <w:r>
+        <w:rPr>
+          <w:lang w:val="pt-PT"/>
+        </w:rPr>
+        <w:t xml:space="preserve"> da página</w:t>
+      </w:r>
+      <w:r>
+        <w:rPr>
+          <w:lang w:val="pt-PT"/>
+        </w:rPr>
+        <w:t>.</w:t>
+      </w:r>
     </w:p>
     <w:p>
       <w:pPr>
@@ -775,6 +1262,7 @@
         <w:rPr>
           <w:lang w:val="pt-PT"/>
         </w:rPr>
+        <w:lastRenderedPageBreak/>
         <w:t>Método</w:t>
       </w:r>
     </w:p>
@@ -822,6 +1310,26 @@
     </w:p>
     <w:p>
       <w:pPr>
+        <w:rPr>
+          <w:u w:val="single"/>
+          <w:lang w:val="pt-PT"/>
+        </w:rPr>
+      </w:pPr>
+      <w:r>
+        <w:rPr>
+          <w:lang w:val="pt-PT"/>
+        </w:rPr>
+        <w:t>Nós temos 22 participantes</w:t>
+      </w:r>
+      <w:r>
+        <w:rPr>
+          <w:lang w:val="pt-PT"/>
+        </w:rPr>
+        <w:t xml:space="preserve"> de 2 grupos etários diferentes (1 grupo etário entre os 20 e os 30 anos de idade e outro grupo etário entre os 50 e os 60 anos de idade).</w:t>
+      </w:r>
+    </w:p>
+    <w:p>
+      <w:pPr>
         <w:pStyle w:val="Ttulo2"/>
         <w:rPr>
           <w:lang w:val="pt-PT"/>
@@ -852,9 +1360,16 @@
     <w:p>
       <w:pPr>
         <w:rPr>
-          <w:lang w:val="pt-PT"/>
-        </w:rPr>
-      </w:pPr>
+          <w:u w:val="single"/>
+          <w:lang w:val="pt-PT"/>
+        </w:rPr>
+      </w:pPr>
+      <w:r>
+        <w:rPr>
+          <w:lang w:val="pt-PT"/>
+        </w:rPr>
+        <w:t>Mencionar o que está descrito no enunciado e, para além disso, dizer que teriam de clicar no alvo atual (alvo verde com o nº 1) e que o próximo alvo (alvo amarelo com o nº 2) era indicativo de qual o alvo a seguir.</w:t>
+      </w:r>
     </w:p>
     <w:p>
       <w:pPr>
@@ -887,6 +1402,62 @@
     </w:p>
     <w:p>
       <w:pPr>
+        <w:rPr>
+          <w:u w:val="single"/>
+          <w:lang w:val="pt-PT"/>
+        </w:rPr>
+      </w:pPr>
+      <w:r>
+        <w:rPr>
+          <w:lang w:val="pt-PT"/>
+        </w:rPr>
+        <w:t xml:space="preserve">Neste caso, seriam: Age, </w:t>
+      </w:r>
+      <w:proofErr w:type="spellStart"/>
+      <w:r>
+        <w:rPr>
+          <w:lang w:val="pt-PT"/>
+        </w:rPr>
+        <w:t>Successes</w:t>
+      </w:r>
+      <w:proofErr w:type="spellEnd"/>
+      <w:r>
+        <w:rPr>
+          <w:lang w:val="pt-PT"/>
+        </w:rPr>
+        <w:t xml:space="preserve">, </w:t>
+      </w:r>
+      <w:proofErr w:type="spellStart"/>
+      <w:r>
+        <w:rPr>
+          <w:lang w:val="pt-PT"/>
+        </w:rPr>
+        <w:t>Failures</w:t>
+      </w:r>
+      <w:proofErr w:type="spellEnd"/>
+      <w:r>
+        <w:rPr>
+          <w:lang w:val="pt-PT"/>
+        </w:rPr>
+        <w:t xml:space="preserve">, </w:t>
+      </w:r>
+      <w:proofErr w:type="spellStart"/>
+      <w:r>
+        <w:rPr>
+          <w:lang w:val="pt-PT"/>
+        </w:rPr>
+        <w:t>Mistakes</w:t>
+      </w:r>
+      <w:proofErr w:type="spellEnd"/>
+      <w:r>
+        <w:rPr>
+          <w:lang w:val="pt-PT"/>
+        </w:rPr>
+        <w:t>, Total Time</w:t>
+      </w:r>
+    </w:p>
+    <w:p>
+      <w:pPr>
         <w:pStyle w:val="Ttulo2"/>
         <w:rPr>
           <w:lang w:val="pt-PT"/>
@@ -955,7 +1526,6 @@
         <w:rPr>
           <w:lang w:val="pt-PT"/>
         </w:rPr>
-        <w:lastRenderedPageBreak/>
         <w:t>Resultados</w:t>
       </w:r>
     </w:p>
@@ -1167,6 +1737,7 @@
         <w:rPr>
           <w:lang w:val="pt-PT"/>
         </w:rPr>
+        <w:lastRenderedPageBreak/>
         <w:t>&lt;Limitações da solução&gt;</w:t>
       </w:r>
     </w:p>
@@ -1208,95 +1779,124 @@
     </w:p>
     <w:p>
       <w:pPr>
-        <w:rPr>
-          <w:lang w:val="pt-PT"/>
-        </w:rPr>
-      </w:pPr>
-    </w:p>
-    <w:p>
-      <w:pPr>
-        <w:rPr>
-          <w:lang w:val="pt-PT"/>
-        </w:rPr>
-      </w:pPr>
-      <w:r>
-        <w:rPr>
-          <w:lang w:val="pt-PT"/>
-        </w:rPr>
-        <w:t>&lt;Avaliação subjetiva do trabalho realizado pela equipa, incluindo assimetrias de esforço entre os colegas de grupo&gt;</w:t>
-      </w:r>
-    </w:p>
-    <w:p>
-      <w:pPr>
-        <w:rPr>
-          <w:lang w:val="pt-PT"/>
-        </w:rPr>
-      </w:pPr>
-    </w:p>
-    <w:p>
-      <w:pPr>
-        <w:rPr>
-          <w:lang w:val="pt-PT"/>
-        </w:rPr>
-      </w:pPr>
-    </w:p>
-    <w:p>
-      <w:pPr>
-        <w:rPr>
-          <w:lang w:val="pt-PT"/>
-        </w:rPr>
-      </w:pPr>
+        <w:jc w:val="both"/>
+        <w:rPr>
+          <w:lang w:val="pt-PT"/>
+        </w:rPr>
+      </w:pPr>
+      <w:r>
+        <w:rPr>
+          <w:lang w:val="pt-PT"/>
+        </w:rPr>
+        <w:t xml:space="preserve">Com este trabalho procurou-se melhorar a eficiência da tarefa de seleção na aplicação </w:t>
+      </w:r>
+      <w:proofErr w:type="spellStart"/>
+      <w:r>
+        <w:rPr>
+          <w:i/>
+          <w:iCs/>
+          <w:lang w:val="pt-PT"/>
+        </w:rPr>
+        <w:t>Click</w:t>
+      </w:r>
+      <w:proofErr w:type="spellEnd"/>
+      <w:r>
+        <w:rPr>
+          <w:i/>
+          <w:iCs/>
+          <w:lang w:val="pt-PT"/>
+        </w:rPr>
+        <w:t xml:space="preserve"> </w:t>
+      </w:r>
+      <w:proofErr w:type="spellStart"/>
+      <w:r>
+        <w:rPr>
+          <w:i/>
+          <w:iCs/>
+          <w:lang w:val="pt-PT"/>
+        </w:rPr>
+        <w:t>the</w:t>
+      </w:r>
+      <w:proofErr w:type="spellEnd"/>
+      <w:r>
+        <w:rPr>
+          <w:i/>
+          <w:iCs/>
+          <w:lang w:val="pt-PT"/>
+        </w:rPr>
+        <w:t xml:space="preserve"> Target</w:t>
+      </w:r>
+      <w:r>
+        <w:rPr>
+          <w:lang w:val="pt-PT"/>
+        </w:rPr>
+        <w:t xml:space="preserve"> através de um conjunto de alterações simples, mas orientadas para problemas observados durante a interação dos utilizadores. As modificações introduzidas tiveram como objetivo reduzir a carga cognitiva, facilitar a identificação do alvo correto e tornar a interação mais rápida e controlada, sem comprometer a eficácia. Os resultados obtidos indicam que a solução proposta contribui para um melhor desempenho, refletido sobretudo na redução dos tempos de execução e numa maior consistência na seleção dos alvos. De forma geral, este projeto mostra que pequenas decisões de design, baseadas na observação do comportamento dos utilizadores e em princípios básicos de usabilidade, podem ter um impacto relevante na qualidade da interação.</w:t>
+      </w:r>
     </w:p>
     <w:p>
       <w:pPr>
         <w:pStyle w:val="Ttulo1"/>
+        <w:rPr>
+          <w:lang w:val="pt-PT"/>
+        </w:rPr>
       </w:pPr>
       <w:bookmarkStart w:id="14" w:name="_4pkpdev5pskd" w:colFirst="0" w:colLast="0"/>
       <w:bookmarkEnd w:id="14"/>
-      <w:proofErr w:type="spellStart"/>
-      <w:r>
+      <w:r>
+        <w:rPr>
+          <w:lang w:val="pt-PT"/>
+        </w:rPr>
         <w:t>Referências</w:t>
       </w:r>
-      <w:proofErr w:type="spellEnd"/>
-    </w:p>
-    <w:p>
-      <w:pPr>
+    </w:p>
+    <w:p>
+      <w:pPr>
+        <w:pStyle w:val="NormalWeb"/>
         <w:numPr>
           <w:ilvl w:val="0"/>
           <w:numId w:val="1"/>
         </w:numPr>
-      </w:pPr>
-      <w:r>
-        <w:t xml:space="preserve">Kane, S.K., </w:t>
-      </w:r>
-      <w:proofErr w:type="spellStart"/>
-      <w:r>
-        <w:t>Wobbrock</w:t>
-      </w:r>
-      <w:proofErr w:type="spellEnd"/>
-      <w:r>
-        <w:t>, J.O. and Smith, I.E. (2008). Getting off the treadmill: Evaluating walking user interfaces for mobile devices in public spaces. Proceedings of the ACM Conference on Human-Computer Interaction with Mobile Devices and Services (</w:t>
-      </w:r>
-      <w:proofErr w:type="spellStart"/>
-      <w:r>
-        <w:t>MobileHCI</w:t>
-      </w:r>
-      <w:proofErr w:type="spellEnd"/>
-      <w:r>
-        <w:t xml:space="preserve"> '08). Amsterdam, Netherlands (September 18-20, 2008). New York: ACM Press, pp. 109-118.  </w:t>
-      </w:r>
-      <w:hyperlink r:id="rId5">
-        <w:r>
-          <w:rPr>
-            <w:color w:val="1155CC"/>
-            <w:u w:val="single"/>
-          </w:rPr>
-          <w:t>https://faculty.washington.edu/wobbrock/pubs/mobilehci-08.pdf</w:t>
-        </w:r>
-      </w:hyperlink>
-    </w:p>
-    <w:p>
-      <w:pPr>
+        <w:rPr>
+          <w:lang w:val="en-US"/>
+        </w:rPr>
+      </w:pPr>
+      <w:r>
+        <w:rPr>
+          <w:lang w:val="en-US"/>
+        </w:rPr>
+        <w:t xml:space="preserve">Cockburn, A., Ahlström, D., &amp; </w:t>
+      </w:r>
+      <w:proofErr w:type="spellStart"/>
+      <w:r>
+        <w:rPr>
+          <w:lang w:val="en-US"/>
+        </w:rPr>
+        <w:t>Gutwin</w:t>
+      </w:r>
+      <w:proofErr w:type="spellEnd"/>
+      <w:r>
+        <w:rPr>
+          <w:lang w:val="en-US"/>
+        </w:rPr>
+        <w:t xml:space="preserve">, C. (2012). </w:t>
+      </w:r>
+      <w:r>
+        <w:rPr>
+          <w:rStyle w:val="nfase"/>
+          <w:lang w:val="en-US"/>
+        </w:rPr>
+        <w:t>Understanding performance in touch pointing: The effects of target visibility and cursor design</w:t>
+      </w:r>
+      <w:r>
+        <w:rPr>
+          <w:lang w:val="en-US"/>
+        </w:rPr>
+        <w:t>. International Journal of Human-Computer Studies, 70(3), 218–231. https://doi.org/10.1016/j.ijhcs.2011.12.003</w:t>
+      </w:r>
+    </w:p>
+    <w:p>
+      <w:pPr>
+        <w:pStyle w:val="NormalWeb"/>
         <w:numPr>
           <w:ilvl w:val="0"/>
           <w:numId w:val="1"/>
@@ -1304,53 +1904,51 @@
       </w:pPr>
       <w:r>
         <w:rPr>
-          <w:lang w:val="pt-PT"/>
-        </w:rPr>
-        <w:t xml:space="preserve">Rodrigues, A., Nicolau, H., </w:t>
-      </w:r>
-      <w:proofErr w:type="spellStart"/>
-      <w:r>
-        <w:rPr>
-          <w:lang w:val="pt-PT"/>
-        </w:rPr>
-        <w:t>Montague</w:t>
-      </w:r>
-      <w:proofErr w:type="spellEnd"/>
-      <w:r>
-        <w:rPr>
-          <w:lang w:val="pt-PT"/>
-        </w:rPr>
-        <w:t xml:space="preserve">, K., Carriço, L., &amp; Guerreiro, T. (2016, </w:t>
-      </w:r>
-      <w:proofErr w:type="spellStart"/>
-      <w:r>
-        <w:rPr>
-          <w:lang w:val="pt-PT"/>
-        </w:rPr>
-        <w:t>September</w:t>
-      </w:r>
-      <w:proofErr w:type="spellEnd"/>
-      <w:r>
-        <w:rPr>
-          <w:lang w:val="pt-PT"/>
-        </w:rPr>
-        <w:t xml:space="preserve">). </w:t>
-      </w:r>
-      <w:r>
-        <w:t xml:space="preserve">Effect of target size on non-visual text-entry. In Proceedings of the 18th International conference on human-computer interaction with mobile devices and services (pp. 47-52). </w:t>
-      </w:r>
-      <w:hyperlink r:id="rId6">
-        <w:r>
-          <w:rPr>
-            <w:color w:val="1155CC"/>
-            <w:u w:val="single"/>
-          </w:rPr>
-          <w:t>http://www.di.fc.ul.pt/~tjvg/amc/tiny_mhci.pdf</w:t>
-        </w:r>
-      </w:hyperlink>
-    </w:p>
-    <w:p>
-      <w:pPr>
+          <w:lang w:val="en-US"/>
+        </w:rPr>
+        <w:t xml:space="preserve">Fitts, P. M. (1954). </w:t>
+      </w:r>
+      <w:r>
+        <w:rPr>
+          <w:rStyle w:val="nfase"/>
+          <w:lang w:val="en-US"/>
+        </w:rPr>
+        <w:t>The information capacity of the human motor system in controlling the amplitude of movement</w:t>
+      </w:r>
+      <w:r>
+        <w:rPr>
+          <w:lang w:val="en-US"/>
+        </w:rPr>
+        <w:t xml:space="preserve">. </w:t>
+      </w:r>
+      <w:proofErr w:type="spellStart"/>
+      <w:r>
+        <w:t>Journal</w:t>
+      </w:r>
+      <w:proofErr w:type="spellEnd"/>
+      <w:r>
+        <w:t xml:space="preserve"> </w:t>
+      </w:r>
+      <w:proofErr w:type="spellStart"/>
+      <w:r>
+        <w:t>of</w:t>
+      </w:r>
+      <w:proofErr w:type="spellEnd"/>
+      <w:r>
+        <w:t xml:space="preserve"> Experimental </w:t>
+      </w:r>
+      <w:proofErr w:type="spellStart"/>
+      <w:r>
+        <w:t>Psychology</w:t>
+      </w:r>
+      <w:proofErr w:type="spellEnd"/>
+      <w:r>
+        <w:t>, 47(6), 381–391. https://doi.org/10.1037/h0055392</w:t>
+      </w:r>
+    </w:p>
+    <w:p>
+      <w:pPr>
+        <w:pStyle w:val="NormalWeb"/>
         <w:numPr>
           <w:ilvl w:val="0"/>
           <w:numId w:val="1"/>
@@ -1358,46 +1956,299 @@
       </w:pPr>
       <w:r>
         <w:rPr>
-          <w:lang w:val="pt-PT"/>
-        </w:rPr>
-        <w:t xml:space="preserve">Trindade, D., Rodrigues, A., Guerreiro, T., &amp; Nicolau, H. (2018, </w:t>
-      </w:r>
-      <w:proofErr w:type="spellStart"/>
-      <w:r>
-        <w:rPr>
-          <w:lang w:val="pt-PT"/>
-        </w:rPr>
-        <w:t>April</w:t>
-      </w:r>
-      <w:proofErr w:type="spellEnd"/>
-      <w:r>
-        <w:rPr>
-          <w:lang w:val="pt-PT"/>
-        </w:rPr>
-        <w:t xml:space="preserve">). </w:t>
-      </w:r>
-      <w:r>
-        <w:t>Hybrid-</w:t>
-      </w:r>
-      <w:proofErr w:type="spellStart"/>
-      <w:r>
-        <w:t>Brailler</w:t>
-      </w:r>
-      <w:proofErr w:type="spellEnd"/>
-      <w:r>
-        <w:t xml:space="preserve">: combining physical and gestural interaction for mobile braille input and editing. In Proceedings of the 2018 CHI Conference on Human Factors in Computing Systems (pp. 1-12). </w:t>
-      </w:r>
-      <w:hyperlink r:id="rId7">
-        <w:r>
-          <w:rPr>
-            <w:color w:val="1155CC"/>
-            <w:u w:val="single"/>
-          </w:rPr>
-          <w:t>http://www.di.fc.ul.pt/~tjvg/amc/chi2018_hybrid_brailler.pdf</w:t>
-        </w:r>
-      </w:hyperlink>
-    </w:p>
-    <w:p/>
+          <w:lang w:val="en-US"/>
+        </w:rPr>
+        <w:t xml:space="preserve">MacKenzie, I. S. (1992). </w:t>
+      </w:r>
+      <w:proofErr w:type="spellStart"/>
+      <w:r>
+        <w:rPr>
+          <w:rStyle w:val="nfase"/>
+          <w:lang w:val="en-US"/>
+        </w:rPr>
+        <w:t>Fitts’</w:t>
+      </w:r>
+      <w:proofErr w:type="spellEnd"/>
+      <w:r>
+        <w:rPr>
+          <w:rStyle w:val="nfase"/>
+          <w:lang w:val="en-US"/>
+        </w:rPr>
+        <w:t xml:space="preserve"> law as a research and design tool in human-computer interaction</w:t>
+      </w:r>
+      <w:r>
+        <w:rPr>
+          <w:lang w:val="en-US"/>
+        </w:rPr>
+        <w:t xml:space="preserve">. </w:t>
+      </w:r>
+      <w:proofErr w:type="spellStart"/>
+      <w:r>
+        <w:t>Human</w:t>
+      </w:r>
+      <w:proofErr w:type="spellEnd"/>
+      <w:r>
+        <w:t>–</w:t>
+      </w:r>
+      <w:proofErr w:type="spellStart"/>
+      <w:r>
+        <w:t>Computer</w:t>
+      </w:r>
+      <w:proofErr w:type="spellEnd"/>
+      <w:r>
+        <w:t xml:space="preserve"> </w:t>
+      </w:r>
+      <w:proofErr w:type="spellStart"/>
+      <w:r>
+        <w:t>Interaction</w:t>
+      </w:r>
+      <w:proofErr w:type="spellEnd"/>
+      <w:r>
+        <w:t>, 7(1), 91–139. https://doi.org/10.1207/s15327051hci0701_3</w:t>
+      </w:r>
+    </w:p>
+    <w:p>
+      <w:pPr>
+        <w:pStyle w:val="NormalWeb"/>
+        <w:numPr>
+          <w:ilvl w:val="0"/>
+          <w:numId w:val="1"/>
+        </w:numPr>
+      </w:pPr>
+      <w:r>
+        <w:rPr>
+          <w:lang w:val="en-US"/>
+        </w:rPr>
+        <w:t xml:space="preserve">Norman, D. A. (2013). </w:t>
+      </w:r>
+      <w:r>
+        <w:rPr>
+          <w:rStyle w:val="nfase"/>
+          <w:lang w:val="en-US"/>
+        </w:rPr>
+        <w:t>The design of everyday things</w:t>
+      </w:r>
+      <w:r>
+        <w:rPr>
+          <w:lang w:val="en-US"/>
+        </w:rPr>
+        <w:t xml:space="preserve"> (Revised and expanded edition). </w:t>
+      </w:r>
+      <w:r>
+        <w:t xml:space="preserve">Basic </w:t>
+      </w:r>
+      <w:proofErr w:type="spellStart"/>
+      <w:r>
+        <w:t>Books</w:t>
+      </w:r>
+      <w:proofErr w:type="spellEnd"/>
+      <w:r>
+        <w:t>.</w:t>
+      </w:r>
+    </w:p>
+    <w:p>
+      <w:pPr>
+        <w:pStyle w:val="NormalWeb"/>
+        <w:numPr>
+          <w:ilvl w:val="0"/>
+          <w:numId w:val="1"/>
+        </w:numPr>
+      </w:pPr>
+      <w:proofErr w:type="spellStart"/>
+      <w:r>
+        <w:rPr>
+          <w:lang w:val="en-US"/>
+        </w:rPr>
+        <w:t>Shneiderman</w:t>
+      </w:r>
+      <w:proofErr w:type="spellEnd"/>
+      <w:r>
+        <w:rPr>
+          <w:lang w:val="en-US"/>
+        </w:rPr>
+        <w:t xml:space="preserve">, B., </w:t>
+      </w:r>
+      <w:proofErr w:type="spellStart"/>
+      <w:r>
+        <w:rPr>
+          <w:lang w:val="en-US"/>
+        </w:rPr>
+        <w:t>Plaisant</w:t>
+      </w:r>
+      <w:proofErr w:type="spellEnd"/>
+      <w:r>
+        <w:rPr>
+          <w:lang w:val="en-US"/>
+        </w:rPr>
+        <w:t xml:space="preserve">, C., Cohen, M., Jacobs, S., Elmqvist, N., &amp; </w:t>
+      </w:r>
+      <w:proofErr w:type="spellStart"/>
+      <w:r>
+        <w:rPr>
+          <w:lang w:val="en-US"/>
+        </w:rPr>
+        <w:t>Diakopoulos</w:t>
+      </w:r>
+      <w:proofErr w:type="spellEnd"/>
+      <w:r>
+        <w:rPr>
+          <w:lang w:val="en-US"/>
+        </w:rPr>
+        <w:t xml:space="preserve">, N. (2016). </w:t>
+      </w:r>
+      <w:r>
+        <w:rPr>
+          <w:rStyle w:val="nfase"/>
+          <w:lang w:val="en-US"/>
+        </w:rPr>
+        <w:t>Designing the user interface: Strategies for effective human-computer interaction</w:t>
+      </w:r>
+      <w:r>
+        <w:rPr>
+          <w:lang w:val="en-US"/>
+        </w:rPr>
+        <w:t xml:space="preserve"> (6th ed.). </w:t>
+      </w:r>
+      <w:proofErr w:type="spellStart"/>
+      <w:r>
+        <w:t>Pearson</w:t>
+      </w:r>
+      <w:proofErr w:type="spellEnd"/>
+      <w:r>
+        <w:t>.</w:t>
+      </w:r>
+    </w:p>
+    <w:p>
+      <w:pPr>
+        <w:pStyle w:val="NormalWeb"/>
+        <w:numPr>
+          <w:ilvl w:val="0"/>
+          <w:numId w:val="1"/>
+        </w:numPr>
+      </w:pPr>
+      <w:r>
+        <w:rPr>
+          <w:lang w:val="en-US"/>
+        </w:rPr>
+        <w:t xml:space="preserve">Ware, C. (2013). </w:t>
+      </w:r>
+      <w:r>
+        <w:rPr>
+          <w:rStyle w:val="nfase"/>
+          <w:lang w:val="en-US"/>
+        </w:rPr>
+        <w:t>Information visualization: Perception for design</w:t>
+      </w:r>
+      <w:r>
+        <w:rPr>
+          <w:lang w:val="en-US"/>
+        </w:rPr>
+        <w:t xml:space="preserve"> (3rd ed.). </w:t>
+      </w:r>
+      <w:r>
+        <w:t xml:space="preserve">Morgan </w:t>
+      </w:r>
+      <w:proofErr w:type="spellStart"/>
+      <w:r>
+        <w:t>Kaufmann</w:t>
+      </w:r>
+      <w:proofErr w:type="spellEnd"/>
+      <w:r>
+        <w:t>.</w:t>
+      </w:r>
+    </w:p>
+    <w:p>
+      <w:pPr>
+        <w:pStyle w:val="NormalWeb"/>
+        <w:numPr>
+          <w:ilvl w:val="0"/>
+          <w:numId w:val="1"/>
+        </w:numPr>
+      </w:pPr>
+      <w:proofErr w:type="spellStart"/>
+      <w:r>
+        <w:rPr>
+          <w:lang w:val="en-US"/>
+        </w:rPr>
+        <w:t>Sweller</w:t>
+      </w:r>
+      <w:proofErr w:type="spellEnd"/>
+      <w:r>
+        <w:rPr>
+          <w:lang w:val="en-US"/>
+        </w:rPr>
+        <w:t xml:space="preserve">, J. (1988). </w:t>
+      </w:r>
+      <w:r>
+        <w:rPr>
+          <w:rStyle w:val="nfase"/>
+          <w:lang w:val="en-US"/>
+        </w:rPr>
+        <w:t>Cognitive load during problem solving: Effects on learning</w:t>
+      </w:r>
+      <w:r>
+        <w:rPr>
+          <w:lang w:val="en-US"/>
+        </w:rPr>
+        <w:t xml:space="preserve">. </w:t>
+      </w:r>
+      <w:proofErr w:type="spellStart"/>
+      <w:r>
+        <w:t>Cognitive</w:t>
+      </w:r>
+      <w:proofErr w:type="spellEnd"/>
+      <w:r>
+        <w:t xml:space="preserve"> </w:t>
+      </w:r>
+      <w:proofErr w:type="spellStart"/>
+      <w:r>
+        <w:t>Science</w:t>
+      </w:r>
+      <w:proofErr w:type="spellEnd"/>
+      <w:r>
+        <w:t xml:space="preserve">, 12(2), 257–285. </w:t>
+      </w:r>
+      <w:r>
+        <w:t>https://doi.org/10.1207/s15516709cog1202_4</w:t>
+      </w:r>
+    </w:p>
+    <w:p>
+      <w:pPr>
+        <w:pStyle w:val="NormalWeb"/>
+        <w:numPr>
+          <w:ilvl w:val="0"/>
+          <w:numId w:val="1"/>
+        </w:numPr>
+      </w:pPr>
+      <w:r>
+        <w:rPr>
+          <w:lang w:val="en-US"/>
+        </w:rPr>
+        <w:t xml:space="preserve">Norman, D. A. (2013). </w:t>
+      </w:r>
+      <w:r>
+        <w:rPr>
+          <w:rStyle w:val="nfase"/>
+          <w:lang w:val="en-US"/>
+        </w:rPr>
+        <w:t>The design of everyday things</w:t>
+      </w:r>
+      <w:r>
+        <w:rPr>
+          <w:lang w:val="en-US"/>
+        </w:rPr>
+        <w:t xml:space="preserve"> (Revised and expanded edition). </w:t>
+      </w:r>
+      <w:r>
+        <w:t>Basic Books.</w:t>
+      </w:r>
+    </w:p>
+    <w:p>
+      <w:pPr>
+        <w:pStyle w:val="NormalWeb"/>
+        <w:ind w:left="720"/>
+      </w:pPr>
+    </w:p>
     <w:p/>
     <w:p/>
     <w:p/>
@@ -2127,6 +2978,45 @@
       <w:szCs w:val="32"/>
     </w:rPr>
   </w:style>
+  <w:style w:type="paragraph" w:styleId="NormalWeb">
+    <w:name w:val="Normal (Web)"/>
+    <w:basedOn w:val="Normal"/>
+    <w:uiPriority w:val="99"/>
+    <w:unhideWhenUsed/>
+    <w:rsid w:val="00EF40C6"/>
+    <w:pPr>
+      <w:spacing w:before="100" w:beforeAutospacing="1" w:after="100" w:afterAutospacing="1" w:line="240" w:lineRule="auto"/>
+    </w:pPr>
+    <w:rPr>
+      <w:rFonts w:ascii="Times New Roman" w:eastAsia="Times New Roman" w:hAnsi="Times New Roman" w:cs="Times New Roman"/>
+      <w:sz w:val="24"/>
+      <w:szCs w:val="24"/>
+      <w:lang w:val="pt-PT"/>
+    </w:rPr>
+  </w:style>
+  <w:style w:type="character" w:styleId="nfase">
+    <w:name w:val="Emphasis"/>
+    <w:basedOn w:val="Tipodeletrapredefinidodopargrafo"/>
+    <w:uiPriority w:val="20"/>
+    <w:qFormat/>
+    <w:rsid w:val="00EF40C6"/>
+    <w:rPr>
+      <w:i/>
+      <w:iCs/>
+    </w:rPr>
+  </w:style>
+  <w:style w:type="character" w:styleId="Hiperligao">
+    <w:name w:val="Hyperlink"/>
+    <w:basedOn w:val="Tipodeletrapredefinidodopargrafo"/>
+    <w:uiPriority w:val="99"/>
+    <w:semiHidden/>
+    <w:unhideWhenUsed/>
+    <w:rsid w:val="00CE58F8"/>
+    <w:rPr>
+      <w:color w:val="0000FF"/>
+      <w:u w:val="single"/>
+    </w:rPr>
+  </w:style>
 </w:styles>
 </file>
 

</xml_diff>

<commit_message>
Acabado relatório final do projeto (e substituido o pdf do relatório de análises)
</commit_message>
<xml_diff>
--- a/Projeto B - Relatório.docx
+++ b/Projeto B - Relatório.docx
@@ -5,7 +5,7 @@
   <w:body>
     <w:p>
       <w:pPr>
-        <w:pStyle w:val="Ttulo"/>
+        <w:pStyle w:val="Title"/>
         <w:rPr>
           <w:lang w:val="pt-PT"/>
         </w:rPr>
@@ -107,7 +107,7 @@
     </w:p>
     <w:p>
       <w:pPr>
-        <w:pStyle w:val="Ttulo1"/>
+        <w:pStyle w:val="Heading1"/>
         <w:rPr>
           <w:lang w:val="pt-PT"/>
         </w:rPr>
@@ -215,7 +215,7 @@
     </w:p>
     <w:p>
       <w:pPr>
-        <w:pStyle w:val="Ttulo1"/>
+        <w:pStyle w:val="Heading1"/>
         <w:rPr>
           <w:lang w:val="pt-PT"/>
         </w:rPr>
@@ -268,7 +268,7 @@
     </w:p>
     <w:p>
       <w:pPr>
-        <w:pStyle w:val="Ttulo2"/>
+        <w:pStyle w:val="Heading2"/>
         <w:rPr>
           <w:lang w:val="pt-PT"/>
         </w:rPr>
@@ -412,7 +412,7 @@
     </w:p>
     <w:p>
       <w:pPr>
-        <w:pStyle w:val="Ttulo2"/>
+        <w:pStyle w:val="Heading2"/>
         <w:rPr>
           <w:lang w:val="pt-PT"/>
         </w:rPr>
@@ -574,7 +574,7 @@
     </w:p>
     <w:p>
       <w:pPr>
-        <w:pStyle w:val="Ttulo2"/>
+        <w:pStyle w:val="Heading2"/>
         <w:rPr>
           <w:lang w:val="pt-PT"/>
         </w:rPr>
@@ -674,7 +674,7 @@
     </w:p>
     <w:p>
       <w:pPr>
-        <w:pStyle w:val="Ttulo2"/>
+        <w:pStyle w:val="Heading2"/>
         <w:rPr>
           <w:lang w:val="pt-PT"/>
         </w:rPr>
@@ -774,7 +774,7 @@
     </w:p>
     <w:p>
       <w:pPr>
-        <w:pStyle w:val="Ttulo2"/>
+        <w:pStyle w:val="Heading2"/>
         <w:rPr>
           <w:lang w:val="pt-PT"/>
         </w:rPr>
@@ -880,7 +880,7 @@
     </w:p>
     <w:p>
       <w:pPr>
-        <w:pStyle w:val="Ttulo2"/>
+        <w:pStyle w:val="Heading2"/>
         <w:rPr>
           <w:lang w:val="pt-PT"/>
         </w:rPr>
@@ -1002,7 +1002,7 @@
     </w:p>
     <w:p>
       <w:pPr>
-        <w:pStyle w:val="Ttulo2"/>
+        <w:pStyle w:val="Heading2"/>
         <w:rPr>
           <w:u w:val="single"/>
           <w:lang w:val="pt-PT"/>
@@ -1251,7 +1251,7 @@
     </w:p>
     <w:p>
       <w:pPr>
-        <w:pStyle w:val="Ttulo1"/>
+        <w:pStyle w:val="Heading1"/>
         <w:rPr>
           <w:lang w:val="pt-PT"/>
         </w:rPr>
@@ -1268,7 +1268,7 @@
     </w:p>
     <w:p>
       <w:pPr>
-        <w:pStyle w:val="Ttulo2"/>
+        <w:pStyle w:val="Heading2"/>
         <w:rPr>
           <w:lang w:val="pt-PT"/>
         </w:rPr>
@@ -1300,7 +1300,7 @@
     </w:p>
     <w:p>
       <w:pPr>
-        <w:pStyle w:val="Ttulo2"/>
+        <w:pStyle w:val="Heading2"/>
         <w:rPr>
           <w:lang w:val="pt-PT"/>
         </w:rPr>
@@ -1329,7 +1329,7 @@
     </w:p>
     <w:p>
       <w:pPr>
-        <w:pStyle w:val="Ttulo2"/>
+        <w:pStyle w:val="Heading2"/>
         <w:rPr>
           <w:lang w:val="pt-PT"/>
         </w:rPr>
@@ -1344,32 +1344,188 @@
     <w:p>
       <w:pPr>
         <w:rPr>
-          <w:lang w:val="pt-PT"/>
-        </w:rPr>
-      </w:pPr>
-      <w:r>
-        <w:rPr>
-          <w:lang w:val="pt-PT"/>
-        </w:rPr>
-        <w:t>&lt;Quais as medidas recolhidas e analisadas&gt;</w:t>
-      </w:r>
-    </w:p>
-    <w:p>
-      <w:pPr>
-        <w:rPr>
-          <w:u w:val="single"/>
-          <w:lang w:val="pt-PT"/>
-        </w:rPr>
-      </w:pPr>
-      <w:r>
-        <w:rPr>
-          <w:lang w:val="pt-PT"/>
-        </w:rPr>
-        <w:t xml:space="preserve">Neste caso, seriam: Age, </w:t>
-      </w:r>
-      <w:proofErr w:type="spellStart"/>
-      <w:r>
-        <w:rPr>
+          <w:lang w:val="en-US"/>
+        </w:rPr>
+      </w:pPr>
+      <w:r>
+        <w:rPr>
+          <w:lang w:val="pt-PT"/>
+        </w:rPr>
+        <w:t>Foram recolhidas e analisadas várias medidas quantitativas com o objetivo de avaliar a </w:t>
+      </w:r>
+      <w:r>
+        <w:rPr>
+          <w:b/>
+          <w:bCs/>
+          <w:lang w:val="pt-PT"/>
+        </w:rPr>
+        <w:t>eficiência</w:t>
+      </w:r>
+      <w:r>
+        <w:rPr>
+          <w:lang w:val="pt-PT"/>
+        </w:rPr>
+        <w:t> e a </w:t>
+      </w:r>
+      <w:r>
+        <w:rPr>
+          <w:b/>
+          <w:bCs/>
+          <w:lang w:val="pt-PT"/>
+        </w:rPr>
+        <w:t>eficácia</w:t>
+      </w:r>
+      <w:r>
+        <w:rPr>
+          <w:lang w:val="pt-PT"/>
+        </w:rPr>
+        <w:t> da tarefa de seleção na aplicação </w:t>
+      </w:r>
+      <w:proofErr w:type="spellStart"/>
+      <w:r>
+        <w:rPr>
+          <w:i/>
+          <w:iCs/>
+          <w:lang w:val="pt-PT"/>
+        </w:rPr>
+        <w:t>Click</w:t>
+      </w:r>
+      <w:proofErr w:type="spellEnd"/>
+      <w:r>
+        <w:rPr>
+          <w:i/>
+          <w:iCs/>
+          <w:lang w:val="pt-PT"/>
+        </w:rPr>
+        <w:t xml:space="preserve"> </w:t>
+      </w:r>
+      <w:proofErr w:type="spellStart"/>
+      <w:r>
+        <w:rPr>
+          <w:i/>
+          <w:iCs/>
+          <w:lang w:val="pt-PT"/>
+        </w:rPr>
+        <w:t>the</w:t>
+      </w:r>
+      <w:proofErr w:type="spellEnd"/>
+      <w:r>
+        <w:rPr>
+          <w:i/>
+          <w:iCs/>
+          <w:lang w:val="pt-PT"/>
+        </w:rPr>
+        <w:t xml:space="preserve"> Target</w:t>
+      </w:r>
+      <w:r>
+        <w:rPr>
+          <w:lang w:val="pt-PT"/>
+        </w:rPr>
+        <w:t xml:space="preserve">. </w:t>
+      </w:r>
+      <w:r>
+        <w:rPr>
+          <w:lang w:val="en-US"/>
+        </w:rPr>
+        <w:t xml:space="preserve">As </w:t>
+      </w:r>
+      <w:proofErr w:type="spellStart"/>
+      <w:r>
+        <w:rPr>
+          <w:lang w:val="en-US"/>
+        </w:rPr>
+        <w:t>medidas</w:t>
+      </w:r>
+      <w:proofErr w:type="spellEnd"/>
+      <w:r>
+        <w:rPr>
+          <w:lang w:val="en-US"/>
+        </w:rPr>
+        <w:t xml:space="preserve"> </w:t>
+      </w:r>
+      <w:proofErr w:type="spellStart"/>
+      <w:r>
+        <w:rPr>
+          <w:lang w:val="en-US"/>
+        </w:rPr>
+        <w:t>consideradas</w:t>
+      </w:r>
+      <w:proofErr w:type="spellEnd"/>
+      <w:r>
+        <w:rPr>
+          <w:lang w:val="en-US"/>
+        </w:rPr>
+        <w:t xml:space="preserve"> </w:t>
+      </w:r>
+      <w:proofErr w:type="spellStart"/>
+      <w:r>
+        <w:rPr>
+          <w:lang w:val="en-US"/>
+        </w:rPr>
+        <w:t>foram</w:t>
+      </w:r>
+      <w:proofErr w:type="spellEnd"/>
+      <w:r>
+        <w:rPr>
+          <w:lang w:val="en-US"/>
+        </w:rPr>
+        <w:t xml:space="preserve"> as </w:t>
+      </w:r>
+      <w:proofErr w:type="spellStart"/>
+      <w:r>
+        <w:rPr>
+          <w:lang w:val="en-US"/>
+        </w:rPr>
+        <w:t>seguintes</w:t>
+      </w:r>
+      <w:proofErr w:type="spellEnd"/>
+      <w:r>
+        <w:rPr>
+          <w:lang w:val="en-US"/>
+        </w:rPr>
+        <w:t>:</w:t>
+      </w:r>
+    </w:p>
+    <w:p>
+      <w:pPr>
+        <w:numPr>
+          <w:ilvl w:val="0"/>
+          <w:numId w:val="2"/>
+        </w:numPr>
+        <w:rPr>
+          <w:lang w:val="pt-PT"/>
+        </w:rPr>
+      </w:pPr>
+      <w:r>
+        <w:rPr>
+          <w:b/>
+          <w:bCs/>
+          <w:lang w:val="pt-PT"/>
+        </w:rPr>
+        <w:t>Idade (Age)</w:t>
+      </w:r>
+      <w:r>
+        <w:rPr>
+          <w:lang w:val="pt-PT"/>
+        </w:rPr>
+        <w:t>: idade do participante, utilizada para a definição dos grupos etários (20–30 anos e 50–60 anos).</w:t>
+      </w:r>
+    </w:p>
+    <w:p>
+      <w:pPr>
+        <w:numPr>
+          <w:ilvl w:val="0"/>
+          <w:numId w:val="2"/>
+        </w:numPr>
+        <w:rPr>
+          <w:lang w:val="pt-PT"/>
+        </w:rPr>
+      </w:pPr>
+      <w:proofErr w:type="spellStart"/>
+      <w:r>
+        <w:rPr>
+          <w:b/>
+          <w:bCs/>
           <w:lang w:val="pt-PT"/>
         </w:rPr>
         <w:t>Successes</w:t>
@@ -1379,11 +1535,24 @@
         <w:rPr>
           <w:lang w:val="pt-PT"/>
         </w:rPr>
-        <w:t xml:space="preserve">, </w:t>
-      </w:r>
-      <w:proofErr w:type="spellStart"/>
-      <w:r>
-        <w:rPr>
+        <w:t>: número de seleções corretas realizadas pelo participante.</w:t>
+      </w:r>
+    </w:p>
+    <w:p>
+      <w:pPr>
+        <w:numPr>
+          <w:ilvl w:val="0"/>
+          <w:numId w:val="2"/>
+        </w:numPr>
+        <w:rPr>
+          <w:lang w:val="pt-PT"/>
+        </w:rPr>
+      </w:pPr>
+      <w:proofErr w:type="spellStart"/>
+      <w:r>
+        <w:rPr>
+          <w:b/>
+          <w:bCs/>
           <w:lang w:val="pt-PT"/>
         </w:rPr>
         <w:t>Failures</w:t>
@@ -1393,11 +1562,24 @@
         <w:rPr>
           <w:lang w:val="pt-PT"/>
         </w:rPr>
-        <w:t xml:space="preserve">, </w:t>
-      </w:r>
-      <w:proofErr w:type="spellStart"/>
-      <w:r>
-        <w:rPr>
+        <w:t>: número de falhas registadas (tempo esgotado sem seleção).</w:t>
+      </w:r>
+    </w:p>
+    <w:p>
+      <w:pPr>
+        <w:numPr>
+          <w:ilvl w:val="0"/>
+          <w:numId w:val="2"/>
+        </w:numPr>
+        <w:rPr>
+          <w:lang w:val="pt-PT"/>
+        </w:rPr>
+      </w:pPr>
+      <w:proofErr w:type="spellStart"/>
+      <w:r>
+        <w:rPr>
+          <w:b/>
+          <w:bCs/>
           <w:lang w:val="pt-PT"/>
         </w:rPr>
         <w:t>Mistakes</w:t>
@@ -1407,12 +1589,224 @@
         <w:rPr>
           <w:lang w:val="pt-PT"/>
         </w:rPr>
-        <w:t>, Total Time</w:t>
-      </w:r>
-    </w:p>
-    <w:p>
-      <w:pPr>
-        <w:pStyle w:val="Ttulo2"/>
+        <w:t>: número de seleções incorretas.</w:t>
+      </w:r>
+    </w:p>
+    <w:p>
+      <w:pPr>
+        <w:numPr>
+          <w:ilvl w:val="0"/>
+          <w:numId w:val="2"/>
+        </w:numPr>
+        <w:rPr>
+          <w:lang w:val="pt-PT"/>
+        </w:rPr>
+      </w:pPr>
+      <w:r>
+        <w:rPr>
+          <w:b/>
+          <w:bCs/>
+          <w:lang w:val="pt-PT"/>
+        </w:rPr>
+        <w:t>Total Time (</w:t>
+      </w:r>
+      <w:proofErr w:type="spellStart"/>
+      <w:r>
+        <w:rPr>
+          <w:b/>
+          <w:bCs/>
+          <w:lang w:val="pt-PT"/>
+        </w:rPr>
+        <w:t>Elapsed</w:t>
+      </w:r>
+      <w:proofErr w:type="spellEnd"/>
+      <w:r>
+        <w:rPr>
+          <w:b/>
+          <w:bCs/>
+          <w:lang w:val="pt-PT"/>
+        </w:rPr>
+        <w:t>)</w:t>
+      </w:r>
+      <w:r>
+        <w:rPr>
+          <w:lang w:val="pt-PT"/>
+        </w:rPr>
+        <w:t>: tempo total de execução da tarefa, em segundos.</w:t>
+      </w:r>
+    </w:p>
+    <w:p>
+      <w:pPr>
+        <w:rPr>
+          <w:lang w:val="pt-PT"/>
+        </w:rPr>
+      </w:pPr>
+      <w:r>
+        <w:rPr>
+          <w:lang w:val="pt-PT"/>
+        </w:rPr>
+        <w:t>A partir destas variáveis primárias, foram ainda derivadas as seguintes métricas:</w:t>
+      </w:r>
+    </w:p>
+    <w:p>
+      <w:pPr>
+        <w:numPr>
+          <w:ilvl w:val="0"/>
+          <w:numId w:val="3"/>
+        </w:numPr>
+        <w:rPr>
+          <w:lang w:val="pt-PT"/>
+        </w:rPr>
+      </w:pPr>
+      <w:r>
+        <w:rPr>
+          <w:b/>
+          <w:bCs/>
+          <w:lang w:val="pt-PT"/>
+        </w:rPr>
+        <w:t>Tempo médio por alvo (Time per Target)</w:t>
+      </w:r>
+      <w:r>
+        <w:rPr>
+          <w:lang w:val="pt-PT"/>
+        </w:rPr>
+        <w:t>: calculado como o tempo total dividido pelo número de sucessos, refletindo a eficiência média de cada seleção.</w:t>
+      </w:r>
+    </w:p>
+    <w:p>
+      <w:pPr>
+        <w:numPr>
+          <w:ilvl w:val="0"/>
+          <w:numId w:val="3"/>
+        </w:numPr>
+        <w:rPr>
+          <w:lang w:val="pt-PT"/>
+        </w:rPr>
+      </w:pPr>
+      <w:r>
+        <w:rPr>
+          <w:b/>
+          <w:bCs/>
+          <w:lang w:val="pt-PT"/>
+        </w:rPr>
+        <w:t>Taxa de sucesso (</w:t>
+      </w:r>
+      <w:proofErr w:type="spellStart"/>
+      <w:r>
+        <w:rPr>
+          <w:b/>
+          <w:bCs/>
+          <w:lang w:val="pt-PT"/>
+        </w:rPr>
+        <w:t>Success</w:t>
+      </w:r>
+      <w:proofErr w:type="spellEnd"/>
+      <w:r>
+        <w:rPr>
+          <w:b/>
+          <w:bCs/>
+          <w:lang w:val="pt-PT"/>
+        </w:rPr>
+        <w:t xml:space="preserve"> Rate)</w:t>
+      </w:r>
+      <w:r>
+        <w:rPr>
+          <w:lang w:val="pt-PT"/>
+        </w:rPr>
+        <w:t>: razão entre o número de sucessos e o número total de alvos apresentados.</w:t>
+      </w:r>
+    </w:p>
+    <w:p>
+      <w:pPr>
+        <w:numPr>
+          <w:ilvl w:val="0"/>
+          <w:numId w:val="3"/>
+        </w:numPr>
+        <w:rPr>
+          <w:lang w:val="pt-PT"/>
+        </w:rPr>
+      </w:pPr>
+      <w:r>
+        <w:rPr>
+          <w:b/>
+          <w:bCs/>
+          <w:lang w:val="pt-PT"/>
+        </w:rPr>
+        <w:t>Erros totais (</w:t>
+      </w:r>
+      <w:proofErr w:type="spellStart"/>
+      <w:r>
+        <w:rPr>
+          <w:b/>
+          <w:bCs/>
+          <w:lang w:val="pt-PT"/>
+        </w:rPr>
+        <w:t>Errors</w:t>
+      </w:r>
+      <w:proofErr w:type="spellEnd"/>
+      <w:r>
+        <w:rPr>
+          <w:b/>
+          <w:bCs/>
+          <w:lang w:val="pt-PT"/>
+        </w:rPr>
+        <w:t>)</w:t>
+      </w:r>
+      <w:r>
+        <w:rPr>
+          <w:lang w:val="pt-PT"/>
+        </w:rPr>
+        <w:t>: soma do número de </w:t>
+      </w:r>
+      <w:proofErr w:type="spellStart"/>
+      <w:r>
+        <w:rPr>
+          <w:i/>
+          <w:iCs/>
+          <w:lang w:val="pt-PT"/>
+        </w:rPr>
+        <w:t>mistakes</w:t>
+      </w:r>
+      <w:proofErr w:type="spellEnd"/>
+      <w:r>
+        <w:rPr>
+          <w:lang w:val="pt-PT"/>
+        </w:rPr>
+        <w:t> e </w:t>
+      </w:r>
+      <w:proofErr w:type="spellStart"/>
+      <w:r>
+        <w:rPr>
+          <w:i/>
+          <w:iCs/>
+          <w:lang w:val="pt-PT"/>
+        </w:rPr>
+        <w:t>failures</w:t>
+      </w:r>
+      <w:proofErr w:type="spellEnd"/>
+      <w:r>
+        <w:rPr>
+          <w:lang w:val="pt-PT"/>
+        </w:rPr>
+        <w:t>, utilizada como indicador global de eficácia.</w:t>
+      </w:r>
+    </w:p>
+    <w:p>
+      <w:pPr>
+        <w:rPr>
+          <w:lang w:val="pt-PT"/>
+        </w:rPr>
+      </w:pPr>
+      <w:r>
+        <w:rPr>
+          <w:lang w:val="pt-PT"/>
+        </w:rPr>
+        <w:t>Estas medidas permitem caracterizar o desempenho dos participantes tanto ao nível da rapidez da interação como da sua precisão.</w:t>
+      </w:r>
+    </w:p>
+    <w:p>
+      <w:pPr>
+        <w:pStyle w:val="Heading2"/>
         <w:rPr>
           <w:lang w:val="pt-PT"/>
         </w:rPr>
@@ -1470,7 +1864,7 @@
     </w:p>
     <w:p>
       <w:pPr>
-        <w:pStyle w:val="Ttulo1"/>
+        <w:pStyle w:val="Heading1"/>
         <w:rPr>
           <w:lang w:val="pt-PT"/>
         </w:rPr>
@@ -1497,7 +1891,7 @@
     </w:p>
     <w:p>
       <w:pPr>
-        <w:pStyle w:val="Ttulo2"/>
+        <w:pStyle w:val="Heading2"/>
         <w:rPr>
           <w:lang w:val="pt-PT"/>
         </w:rPr>
@@ -1508,221 +1902,734 @@
         <w:rPr>
           <w:lang w:val="pt-PT"/>
         </w:rPr>
+        <w:lastRenderedPageBreak/>
         <w:t>Por métrica analisada</w:t>
       </w:r>
     </w:p>
     <w:p>
       <w:pPr>
-        <w:rPr>
-          <w:lang w:val="pt-PT"/>
-        </w:rPr>
-      </w:pPr>
-      <w:r>
-        <w:rPr>
-          <w:lang w:val="pt-PT"/>
-        </w:rPr>
-        <w:t>&lt;Análise das variáveis recolhidas: textual e gráfica&gt;</w:t>
-      </w:r>
-    </w:p>
-    <w:p>
-      <w:pPr>
-        <w:rPr>
-          <w:lang w:val="pt-PT"/>
-        </w:rPr>
-      </w:pPr>
-      <w:r>
-        <w:rPr>
-          <w:lang w:val="pt-PT"/>
-        </w:rPr>
-        <w:t>&lt;Deve ser possível ter uma ideia clara dos resultados obtidos ao nível do tempo, erros, sucesso&gt;</w:t>
-      </w:r>
-    </w:p>
-    <w:p>
-      <w:pPr>
-        <w:rPr>
-          <w:lang w:val="pt-PT"/>
-        </w:rPr>
-      </w:pPr>
-      <w:r>
-        <w:rPr>
-          <w:lang w:val="pt-PT"/>
-        </w:rPr>
-        <w:t xml:space="preserve">&lt;Opcionalmente, podem oferecer resultados ao nível da eficácia e eficiência por alvo. Ver exemplo do </w:t>
-      </w:r>
-      <w:proofErr w:type="spellStart"/>
-      <w:r>
-        <w:rPr>
-          <w:lang w:val="pt-PT"/>
-        </w:rPr>
-        <w:t>heatmap</w:t>
-      </w:r>
-      <w:proofErr w:type="spellEnd"/>
-      <w:r>
-        <w:rPr>
-          <w:lang w:val="pt-PT"/>
-        </w:rPr>
-        <w:t xml:space="preserve"> de teclado em [2]&gt; </w:t>
-      </w:r>
-    </w:p>
-    <w:p>
-      <w:pPr>
-        <w:rPr>
-          <w:lang w:val="pt-PT"/>
-        </w:rPr>
-      </w:pPr>
-      <w:r>
-        <w:rPr>
-          <w:lang w:val="pt-PT"/>
-        </w:rPr>
-        <w:t>&lt;Outros resultados que achem interessantes&gt;</w:t>
-      </w:r>
-    </w:p>
-    <w:p>
-      <w:pPr>
-        <w:rPr>
-          <w:lang w:val="pt-PT"/>
-        </w:rPr>
-      </w:pPr>
-    </w:p>
-    <w:p>
-      <w:pPr>
-        <w:rPr>
-          <w:lang w:val="pt-PT"/>
-        </w:rPr>
-      </w:pPr>
-      <w:r>
-        <w:rPr>
-          <w:lang w:val="pt-PT"/>
-        </w:rPr>
-        <w:t>&lt;Análise comparativa dos dados recolhidos com os dados oferecidos pelo corpo docente (</w:t>
-      </w:r>
-      <w:proofErr w:type="spellStart"/>
-      <w:r>
-        <w:rPr>
-          <w:lang w:val="pt-PT"/>
-        </w:rPr>
-        <w:t>baseline</w:t>
-      </w:r>
-      <w:proofErr w:type="spellEnd"/>
-      <w:r>
-        <w:rPr>
-          <w:lang w:val="pt-PT"/>
-        </w:rPr>
-        <w:t>) em relação a tempos, sucessos, e número de erros&gt;</w:t>
-      </w:r>
-    </w:p>
-    <w:p>
-      <w:pPr>
-        <w:rPr>
-          <w:lang w:val="pt-PT"/>
-        </w:rPr>
-      </w:pPr>
-      <w:r>
-        <w:rPr>
-          <w:lang w:val="pt-PT"/>
-        </w:rPr>
-        <w:t xml:space="preserve">&lt;Análise </w:t>
-      </w:r>
-      <w:proofErr w:type="spellStart"/>
-      <w:r>
-        <w:rPr>
-          <w:lang w:val="pt-PT"/>
-        </w:rPr>
-        <w:t>correlacional</w:t>
-      </w:r>
-      <w:proofErr w:type="spellEnd"/>
-      <w:r>
-        <w:rPr>
-          <w:lang w:val="pt-PT"/>
-        </w:rPr>
-        <w:t xml:space="preserve"> entre tempos e idade, para a vossa solução&gt;</w:t>
-      </w:r>
-    </w:p>
-    <w:p>
-      <w:pPr>
-        <w:rPr>
-          <w:lang w:val="pt-PT"/>
-        </w:rPr>
-      </w:pPr>
-      <w:r>
-        <w:rPr>
-          <w:lang w:val="pt-PT"/>
-        </w:rPr>
-        <w:t>&lt;Opcional: outras análises que achem relevantes&gt;</w:t>
-      </w:r>
-    </w:p>
-    <w:p>
-      <w:pPr>
-        <w:pStyle w:val="Ttulo1"/>
-        <w:rPr>
-          <w:lang w:val="pt-PT"/>
-        </w:rPr>
-      </w:pPr>
-      <w:bookmarkStart w:id="9" w:name="_sn2ndakwq9m3" w:colFirst="0" w:colLast="0"/>
+        <w:pStyle w:val="Heading1"/>
+        <w:rPr>
+          <w:b/>
+          <w:bCs/>
+          <w:sz w:val="28"/>
+          <w:szCs w:val="28"/>
+          <w:lang w:val="pt-PT"/>
+        </w:rPr>
+      </w:pPr>
+      <w:r>
+        <w:rPr>
+          <w:b/>
+          <w:bCs/>
+          <w:sz w:val="28"/>
+          <w:szCs w:val="28"/>
+          <w:lang w:val="pt-PT"/>
+        </w:rPr>
+        <w:t>Comparação entre a solução proposta e a solução standard</w:t>
+      </w:r>
+    </w:p>
+    <w:p>
+      <w:pPr>
+        <w:pStyle w:val="Heading1"/>
+        <w:spacing w:before="0"/>
+        <w:rPr>
+          <w:sz w:val="22"/>
+          <w:szCs w:val="22"/>
+          <w:lang w:val="pt-PT"/>
+        </w:rPr>
+      </w:pPr>
+      <w:r>
+        <w:rPr>
+          <w:sz w:val="22"/>
+          <w:szCs w:val="22"/>
+          <w:lang w:val="pt-PT"/>
+        </w:rPr>
+        <w:t>Atendendo à natureza não normal das distribuições de tempo e erro, foi utilizado o teste não paramétrico de Mann–</w:t>
+      </w:r>
+      <w:proofErr w:type="spellStart"/>
+      <w:r>
+        <w:rPr>
+          <w:sz w:val="22"/>
+          <w:szCs w:val="22"/>
+          <w:lang w:val="pt-PT"/>
+        </w:rPr>
+        <w:t>Whitney</w:t>
+      </w:r>
+      <w:proofErr w:type="spellEnd"/>
+      <w:r>
+        <w:rPr>
+          <w:sz w:val="22"/>
+          <w:szCs w:val="22"/>
+          <w:lang w:val="pt-PT"/>
+        </w:rPr>
+        <w:t xml:space="preserve"> U para comparar os dois grupos independentes (solução proposta vs. solução standard), com um nível de significância de α = 0.05.</w:t>
+      </w:r>
+    </w:p>
+    <w:p>
+      <w:pPr>
+        <w:pStyle w:val="Heading1"/>
+        <w:numPr>
+          <w:ilvl w:val="0"/>
+          <w:numId w:val="4"/>
+        </w:numPr>
+        <w:rPr>
+          <w:sz w:val="22"/>
+          <w:szCs w:val="22"/>
+          <w:lang w:val="pt-PT"/>
+        </w:rPr>
+      </w:pPr>
+      <w:r>
+        <w:rPr>
+          <w:sz w:val="22"/>
+          <w:szCs w:val="22"/>
+          <w:lang w:val="pt-PT"/>
+        </w:rPr>
+        <w:t>Tempo total de execução (</w:t>
+      </w:r>
+      <w:proofErr w:type="spellStart"/>
+      <w:r>
+        <w:rPr>
+          <w:sz w:val="22"/>
+          <w:szCs w:val="22"/>
+          <w:lang w:val="pt-PT"/>
+        </w:rPr>
+        <w:t>Elapsed</w:t>
+      </w:r>
+      <w:proofErr w:type="spellEnd"/>
+      <w:r>
+        <w:rPr>
+          <w:sz w:val="22"/>
+          <w:szCs w:val="22"/>
+          <w:lang w:val="pt-PT"/>
+        </w:rPr>
+        <w:t>)</w:t>
+      </w:r>
+    </w:p>
+    <w:p>
+      <w:pPr>
+        <w:pStyle w:val="Heading1"/>
+        <w:spacing w:before="0"/>
+        <w:rPr>
+          <w:sz w:val="22"/>
+          <w:szCs w:val="22"/>
+          <w:lang w:val="pt-PT"/>
+        </w:rPr>
+      </w:pPr>
+      <w:r>
+        <w:rPr>
+          <w:sz w:val="22"/>
+          <w:szCs w:val="22"/>
+          <w:lang w:val="pt-PT"/>
+        </w:rPr>
+        <w:t>Verificou-se uma redução estatisticamente significativa no tempo total de execução na solução proposta (mediana = 12.652 s) quando comparada com a solução standard (mediana = 19.613 s), U = 1974.5, p &lt; 0.001.</w:t>
+      </w:r>
+    </w:p>
+    <w:p>
+      <w:pPr>
+        <w:pStyle w:val="Heading1"/>
+        <w:spacing w:before="0"/>
+        <w:rPr>
+          <w:sz w:val="22"/>
+          <w:szCs w:val="22"/>
+          <w:lang w:val="pt-PT"/>
+        </w:rPr>
+      </w:pPr>
+      <w:r>
+        <w:rPr>
+          <w:sz w:val="22"/>
+          <w:szCs w:val="22"/>
+          <w:lang w:val="pt-PT"/>
+        </w:rPr>
+        <w:t>Este resultado indica uma melhoria clara da eficiência da tarefa, embora o tamanho do efeito seja pequeno (r = 0.112).</w:t>
+      </w:r>
+    </w:p>
+    <w:p>
+      <w:pPr>
+        <w:pStyle w:val="Heading1"/>
+        <w:numPr>
+          <w:ilvl w:val="0"/>
+          <w:numId w:val="4"/>
+        </w:numPr>
+        <w:rPr>
+          <w:sz w:val="22"/>
+          <w:szCs w:val="22"/>
+          <w:lang w:val="pt-PT"/>
+        </w:rPr>
+      </w:pPr>
+      <w:r>
+        <w:rPr>
+          <w:sz w:val="22"/>
+          <w:szCs w:val="22"/>
+          <w:lang w:val="pt-PT"/>
+        </w:rPr>
+        <w:t>Tempo médio por alvo (Time per Target)</w:t>
+      </w:r>
+    </w:p>
+    <w:p>
+      <w:pPr>
+        <w:pStyle w:val="Heading1"/>
+        <w:spacing w:before="0"/>
+        <w:rPr>
+          <w:sz w:val="22"/>
+          <w:szCs w:val="22"/>
+          <w:lang w:val="pt-PT"/>
+        </w:rPr>
+      </w:pPr>
+      <w:r>
+        <w:rPr>
+          <w:sz w:val="22"/>
+          <w:szCs w:val="22"/>
+          <w:lang w:val="pt-PT"/>
+        </w:rPr>
+        <w:t>Observou-se igualmente uma redução estatisticamente significativa no tempo médio por alvo na solução proposta (mediana = 0.633 s) face à solução standard (mediana = 0.985 s), U = 1488.5, p &lt; 0.001, confirmando uma execução mais rápida e fluida das seleções.</w:t>
+      </w:r>
+    </w:p>
+    <w:p>
+      <w:pPr>
+        <w:pStyle w:val="Heading1"/>
+        <w:numPr>
+          <w:ilvl w:val="0"/>
+          <w:numId w:val="4"/>
+        </w:numPr>
+        <w:rPr>
+          <w:sz w:val="22"/>
+          <w:szCs w:val="22"/>
+          <w:lang w:val="pt-PT"/>
+        </w:rPr>
+      </w:pPr>
+      <w:r>
+        <w:rPr>
+          <w:sz w:val="22"/>
+          <w:szCs w:val="22"/>
+          <w:lang w:val="pt-PT"/>
+        </w:rPr>
+        <w:t>Taxa de sucesso (</w:t>
+      </w:r>
+      <w:proofErr w:type="spellStart"/>
+      <w:r>
+        <w:rPr>
+          <w:sz w:val="22"/>
+          <w:szCs w:val="22"/>
+          <w:lang w:val="pt-PT"/>
+        </w:rPr>
+        <w:t>Success</w:t>
+      </w:r>
+      <w:proofErr w:type="spellEnd"/>
+      <w:r>
+        <w:rPr>
+          <w:sz w:val="22"/>
+          <w:szCs w:val="22"/>
+          <w:lang w:val="pt-PT"/>
+        </w:rPr>
+        <w:t xml:space="preserve"> Rate)</w:t>
+      </w:r>
+    </w:p>
+    <w:p>
+      <w:pPr>
+        <w:pStyle w:val="Heading1"/>
+        <w:spacing w:before="0"/>
+        <w:rPr>
+          <w:sz w:val="22"/>
+          <w:szCs w:val="22"/>
+          <w:lang w:val="pt-PT"/>
+        </w:rPr>
+      </w:pPr>
+      <w:r>
+        <w:rPr>
+          <w:sz w:val="22"/>
+          <w:szCs w:val="22"/>
+          <w:lang w:val="pt-PT"/>
+        </w:rPr>
+        <w:t>Não foram observadas diferenças estatisticamente significativas na taxa de sucesso entre as duas soluções (mediana = 1.000 em ambos os casos), U = 9190.5, p = 0.9194, indicando que a melhoria da eficiência não comprometeu a eficácia da interação.</w:t>
+      </w:r>
+    </w:p>
+    <w:p>
+      <w:pPr>
+        <w:pStyle w:val="Heading1"/>
+        <w:numPr>
+          <w:ilvl w:val="0"/>
+          <w:numId w:val="4"/>
+        </w:numPr>
+        <w:rPr>
+          <w:sz w:val="22"/>
+          <w:szCs w:val="22"/>
+          <w:lang w:val="pt-PT"/>
+        </w:rPr>
+      </w:pPr>
+      <w:r>
+        <w:rPr>
+          <w:sz w:val="22"/>
+          <w:szCs w:val="22"/>
+          <w:lang w:val="pt-PT"/>
+        </w:rPr>
+        <w:t>Erros totais (</w:t>
+      </w:r>
+      <w:proofErr w:type="spellStart"/>
+      <w:r>
+        <w:rPr>
+          <w:sz w:val="22"/>
+          <w:szCs w:val="22"/>
+          <w:lang w:val="pt-PT"/>
+        </w:rPr>
+        <w:t>Errors</w:t>
+      </w:r>
+      <w:proofErr w:type="spellEnd"/>
+      <w:r>
+        <w:rPr>
+          <w:sz w:val="22"/>
+          <w:szCs w:val="22"/>
+          <w:lang w:val="pt-PT"/>
+        </w:rPr>
+        <w:t>)</w:t>
+      </w:r>
+    </w:p>
+    <w:p>
+      <w:pPr>
+        <w:pStyle w:val="Heading1"/>
+        <w:spacing w:before="0"/>
+        <w:rPr>
+          <w:sz w:val="22"/>
+          <w:szCs w:val="22"/>
+          <w:lang w:val="pt-PT"/>
+        </w:rPr>
+      </w:pPr>
+      <w:r>
+        <w:rPr>
+          <w:sz w:val="22"/>
+          <w:szCs w:val="22"/>
+          <w:lang w:val="pt-PT"/>
+        </w:rPr>
+        <w:t>Embora a solução proposta apresente uma tendência para menos erros, as diferenças não atingiram significância estatística, U = 7999.5, p = 0.0909.</w:t>
+      </w:r>
+    </w:p>
+    <w:p>
+      <w:pPr>
+        <w:pStyle w:val="Heading1"/>
+        <w:spacing w:before="0"/>
+        <w:rPr>
+          <w:sz w:val="22"/>
+          <w:szCs w:val="22"/>
+          <w:lang w:val="pt-PT"/>
+        </w:rPr>
+      </w:pPr>
+      <w:r>
+        <w:rPr>
+          <w:sz w:val="22"/>
+          <w:szCs w:val="22"/>
+          <w:lang w:val="pt-PT"/>
+        </w:rPr>
+        <w:t>De forma geral, os resultados indicam que a solução proposta melhora significativamente a eficiência da tarefa sem prejuízo da eficácia.</w:t>
+      </w:r>
+    </w:p>
+    <w:p>
+      <w:pPr>
+        <w:rPr>
+          <w:lang w:val="pt-PT"/>
+        </w:rPr>
+      </w:pPr>
+    </w:p>
+    <w:p>
+      <w:pPr>
+        <w:rPr>
+          <w:b/>
+          <w:bCs/>
+          <w:sz w:val="28"/>
+          <w:szCs w:val="28"/>
+          <w:lang w:val="pt-PT"/>
+        </w:rPr>
+      </w:pPr>
+      <w:r>
+        <w:rPr>
+          <w:b/>
+          <w:bCs/>
+          <w:sz w:val="28"/>
+          <w:szCs w:val="28"/>
+          <w:lang w:val="pt-PT"/>
+        </w:rPr>
+        <w:t>Análise por grupo etário (solução proposta)</w:t>
+      </w:r>
+    </w:p>
+    <w:p>
+      <w:pPr>
+        <w:rPr>
+          <w:lang w:val="pt-PT"/>
+        </w:rPr>
+      </w:pPr>
+    </w:p>
+    <w:p>
+      <w:pPr>
+        <w:rPr>
+          <w:lang w:val="pt-PT"/>
+        </w:rPr>
+      </w:pPr>
+      <w:r>
+        <w:rPr>
+          <w:lang w:val="pt-PT"/>
+        </w:rPr>
+        <w:t>Foi ainda realizada uma comparação entre os dois grupos etários (20–30 anos e 50–60 anos) considerando apenas a solução proposta.</w:t>
+      </w:r>
+    </w:p>
+    <w:p>
+      <w:pPr>
+        <w:pStyle w:val="ListParagraph"/>
+        <w:numPr>
+          <w:ilvl w:val="0"/>
+          <w:numId w:val="4"/>
+        </w:numPr>
+        <w:spacing w:before="240" w:after="120"/>
+        <w:rPr>
+          <w:lang w:val="pt-PT"/>
+        </w:rPr>
+      </w:pPr>
+      <w:r>
+        <w:rPr>
+          <w:lang w:val="pt-PT"/>
+        </w:rPr>
+        <w:t>Tempo total e tempo por alvo</w:t>
+      </w:r>
+    </w:p>
+    <w:p>
+      <w:pPr>
+        <w:rPr>
+          <w:lang w:val="pt-PT"/>
+        </w:rPr>
+      </w:pPr>
+      <w:r>
+        <w:rPr>
+          <w:lang w:val="pt-PT"/>
+        </w:rPr>
+        <w:t>Os participantes mais jovens apresentaram tempos significativamente inferiores, tanto no tempo total de execução (mediana = 12.466 s vs. 14.990 s) como no tempo médio por alvo (0.623 s vs. 0.750 s), com p &lt; 0.001 em ambos os casos.</w:t>
+      </w:r>
+    </w:p>
+    <w:p>
+      <w:pPr>
+        <w:pStyle w:val="ListParagraph"/>
+        <w:numPr>
+          <w:ilvl w:val="0"/>
+          <w:numId w:val="4"/>
+        </w:numPr>
+        <w:spacing w:before="240" w:after="120"/>
+        <w:rPr>
+          <w:lang w:val="pt-PT"/>
+        </w:rPr>
+      </w:pPr>
+      <w:r>
+        <w:rPr>
+          <w:lang w:val="pt-PT"/>
+        </w:rPr>
+        <w:t>Taxa de sucesso</w:t>
+      </w:r>
+    </w:p>
+    <w:p>
+      <w:pPr>
+        <w:rPr>
+          <w:lang w:val="pt-PT"/>
+        </w:rPr>
+      </w:pPr>
+      <w:r>
+        <w:rPr>
+          <w:lang w:val="pt-PT"/>
+        </w:rPr>
+        <w:t>Não foram observadas diferenças estatisticamente significativas na taxa de sucesso entre os dois grupos etários, indicando níveis semelhantes de eficácia.</w:t>
+      </w:r>
+    </w:p>
+    <w:p>
+      <w:pPr>
+        <w:pStyle w:val="ListParagraph"/>
+        <w:numPr>
+          <w:ilvl w:val="0"/>
+          <w:numId w:val="4"/>
+        </w:numPr>
+        <w:spacing w:before="240" w:after="120"/>
+        <w:rPr>
+          <w:lang w:val="pt-PT"/>
+        </w:rPr>
+      </w:pPr>
+      <w:r>
+        <w:rPr>
+          <w:lang w:val="pt-PT"/>
+        </w:rPr>
+        <w:lastRenderedPageBreak/>
+        <w:t>Erros totais</w:t>
+      </w:r>
+    </w:p>
+    <w:p>
+      <w:pPr>
+        <w:rPr>
+          <w:lang w:val="pt-PT"/>
+        </w:rPr>
+      </w:pPr>
+      <w:r>
+        <w:rPr>
+          <w:lang w:val="pt-PT"/>
+        </w:rPr>
+        <w:t>Verificou-se uma diferença estatisticamente significativa no número de erros, com o grupo dos 20–30 anos a apresentar mais erros do que o grupo dos 50–60 anos (p &lt; 0.001), sugerindo uma possível troca entre velocidade e precisão.</w:t>
+      </w:r>
+    </w:p>
+    <w:p>
+      <w:pPr>
+        <w:rPr>
+          <w:lang w:val="pt-PT"/>
+        </w:rPr>
+      </w:pPr>
+    </w:p>
+    <w:p>
+      <w:pPr>
+        <w:rPr>
+          <w:lang w:val="pt-PT"/>
+        </w:rPr>
+      </w:pPr>
+      <w:r>
+        <w:rPr>
+          <w:lang w:val="pt-PT"/>
+        </w:rPr>
+        <w:t xml:space="preserve">A análise gráfica (através de </w:t>
+      </w:r>
+      <w:proofErr w:type="spellStart"/>
+      <w:r>
+        <w:rPr>
+          <w:lang w:val="pt-PT"/>
+        </w:rPr>
+        <w:t>violin</w:t>
+      </w:r>
+      <w:proofErr w:type="spellEnd"/>
+      <w:r>
+        <w:rPr>
+          <w:lang w:val="pt-PT"/>
+        </w:rPr>
+        <w:t xml:space="preserve"> </w:t>
+      </w:r>
+      <w:proofErr w:type="spellStart"/>
+      <w:r>
+        <w:rPr>
+          <w:lang w:val="pt-PT"/>
+        </w:rPr>
+        <w:t>plots</w:t>
+      </w:r>
+      <w:proofErr w:type="spellEnd"/>
+      <w:r>
+        <w:rPr>
+          <w:lang w:val="pt-PT"/>
+        </w:rPr>
+        <w:t>) corrobora estes resultados, evidenciando distribuições de tempo mais concentradas e com menor dispersão nos participantes mais jovens.</w:t>
+      </w:r>
+    </w:p>
+    <w:p>
+      <w:pPr>
+        <w:pStyle w:val="Heading1"/>
+        <w:rPr>
+          <w:lang w:val="pt-PT"/>
+        </w:rPr>
+      </w:pPr>
+      <w:r>
+        <w:rPr>
+          <w:lang w:val="pt-PT"/>
+        </w:rPr>
+        <w:t>Discussão</w:t>
+      </w:r>
+    </w:p>
+    <w:p>
+      <w:pPr>
+        <w:rPr>
+          <w:lang w:val="pt-PT"/>
+        </w:rPr>
+      </w:pPr>
+      <w:r>
+        <w:rPr>
+          <w:lang w:val="pt-PT"/>
+        </w:rPr>
+        <w:t xml:space="preserve">Os resultados obtidos demonstram que as alterações introduzidas na solução proposta tiveram um impacto positivo na usabilidade da aplicação </w:t>
+      </w:r>
+      <w:proofErr w:type="spellStart"/>
+      <w:r>
+        <w:rPr>
+          <w:lang w:val="pt-PT"/>
+        </w:rPr>
+        <w:t>Click</w:t>
+      </w:r>
+      <w:proofErr w:type="spellEnd"/>
+      <w:r>
+        <w:rPr>
+          <w:lang w:val="pt-PT"/>
+        </w:rPr>
+        <w:t xml:space="preserve"> </w:t>
+      </w:r>
+      <w:proofErr w:type="spellStart"/>
+      <w:r>
+        <w:rPr>
+          <w:lang w:val="pt-PT"/>
+        </w:rPr>
+        <w:t>the</w:t>
+      </w:r>
+      <w:proofErr w:type="spellEnd"/>
+      <w:r>
+        <w:rPr>
+          <w:lang w:val="pt-PT"/>
+        </w:rPr>
+        <w:t xml:space="preserve"> Target, em particular ao nível da eficiência da interação. A redução significativa dos tempos de execução e do tempo médio por alvo está em linha com princípios clássicos de IPM, como a Lei de </w:t>
+      </w:r>
+      <w:proofErr w:type="spellStart"/>
+      <w:r>
+        <w:rPr>
+          <w:lang w:val="pt-PT"/>
+        </w:rPr>
+        <w:t>Fitts</w:t>
+      </w:r>
+      <w:proofErr w:type="spellEnd"/>
+      <w:r>
+        <w:rPr>
+          <w:lang w:val="pt-PT"/>
+        </w:rPr>
+        <w:t xml:space="preserve"> e a orientação visual da atenção.</w:t>
+      </w:r>
+    </w:p>
+    <w:p>
+      <w:pPr>
+        <w:rPr>
+          <w:lang w:val="pt-PT"/>
+        </w:rPr>
+      </w:pPr>
+    </w:p>
+    <w:p>
+      <w:pPr>
+        <w:rPr>
+          <w:lang w:val="pt-PT"/>
+        </w:rPr>
+      </w:pPr>
+      <w:r>
+        <w:rPr>
+          <w:lang w:val="pt-PT"/>
+        </w:rPr>
+        <w:t>O destaque explícito do alvo atual e do próximo alvo, aliado à hierarquia visual criada pela maximização do alvo correto e minimização dos restantes, parece ter reduzido a carga cognitiva associada à procura visual, permitindo seleções mais rápidas sem comprometer a taxa de sucesso. A ausência de diferenças significativas na eficácia confirma que a melhoria da eficiência não foi obtida à custa de um aumento de erros.</w:t>
+      </w:r>
+    </w:p>
+    <w:p>
+      <w:pPr>
+        <w:rPr>
+          <w:lang w:val="pt-PT"/>
+        </w:rPr>
+      </w:pPr>
+    </w:p>
+    <w:p>
+      <w:pPr>
+        <w:rPr>
+          <w:lang w:val="pt-PT"/>
+        </w:rPr>
+      </w:pPr>
+      <w:r>
+        <w:rPr>
+          <w:lang w:val="pt-PT"/>
+        </w:rPr>
+        <w:t>A análise por grupo etário sugere que, embora os participantes mais jovens sejam mais rápidos, os participantes mais velhos apresentam um comportamento mais cauteloso, resultando em menos erros. Estes resultados são consistentes com literatura que aponta para estratégias diferentes de interação em função da idade.</w:t>
+      </w:r>
+    </w:p>
+    <w:p>
+      <w:pPr>
+        <w:rPr>
+          <w:lang w:val="pt-PT"/>
+        </w:rPr>
+      </w:pPr>
+    </w:p>
+    <w:p>
+      <w:pPr>
+        <w:spacing w:after="240"/>
+        <w:rPr>
+          <w:b/>
+          <w:bCs/>
+          <w:sz w:val="28"/>
+          <w:szCs w:val="28"/>
+          <w:lang w:val="pt-PT"/>
+        </w:rPr>
+      </w:pPr>
+      <w:r>
+        <w:rPr>
+          <w:b/>
+          <w:bCs/>
+          <w:sz w:val="28"/>
+          <w:szCs w:val="28"/>
+          <w:lang w:val="pt-PT"/>
+        </w:rPr>
+        <w:t>Limitações da solução</w:t>
+      </w:r>
+    </w:p>
+    <w:p>
+      <w:pPr>
+        <w:rPr>
+          <w:lang w:val="pt-PT"/>
+        </w:rPr>
+      </w:pPr>
+      <w:r>
+        <w:rPr>
+          <w:lang w:val="pt-PT"/>
+        </w:rPr>
+        <w:t>Apesar das melhorias observadas, a solução proposta pode introduzir um maior foco no estímulo visual principal, potencialmente reduzindo a flexibilidade em contextos mais complexos ou com múltiplos objetivos simultâneos.</w:t>
+      </w:r>
+    </w:p>
+    <w:p>
+      <w:pPr>
+        <w:rPr>
+          <w:lang w:val="pt-PT"/>
+        </w:rPr>
+      </w:pPr>
+    </w:p>
+    <w:p>
+      <w:pPr>
+        <w:spacing w:after="240"/>
+        <w:rPr>
+          <w:b/>
+          <w:bCs/>
+          <w:sz w:val="28"/>
+          <w:szCs w:val="28"/>
+          <w:lang w:val="pt-PT"/>
+        </w:rPr>
+      </w:pPr>
+      <w:r>
+        <w:rPr>
+          <w:b/>
+          <w:bCs/>
+          <w:sz w:val="28"/>
+          <w:szCs w:val="28"/>
+          <w:lang w:val="pt-PT"/>
+        </w:rPr>
+        <w:t>Limitações do estudo</w:t>
+      </w:r>
+    </w:p>
+    <w:p>
+      <w:pPr>
+        <w:rPr>
+          <w:lang w:val="pt-PT"/>
+        </w:rPr>
+      </w:pPr>
+      <w:r>
+        <w:rPr>
+          <w:lang w:val="pt-PT"/>
+        </w:rPr>
+        <w:t xml:space="preserve">O estudo apresenta algumas limitações, nomeadamente o tamanho relativamente reduzido da amostra e a ausência de um desenho </w:t>
+      </w:r>
+      <w:proofErr w:type="spellStart"/>
+      <w:r>
+        <w:rPr>
+          <w:lang w:val="pt-PT"/>
+        </w:rPr>
+        <w:t>intra-sujeitos</w:t>
+      </w:r>
+      <w:proofErr w:type="spellEnd"/>
+      <w:r>
+        <w:rPr>
+          <w:lang w:val="pt-PT"/>
+        </w:rPr>
+        <w:t>, o que poderia permitir uma comparação mais controlada entre soluções. Adicionalmente, a recolha de dados foi realizada num contexto específico de hardware e ambiente, o que pode limitar a generalização dos resultados.</w:t>
+      </w:r>
+    </w:p>
+    <w:p>
+      <w:pPr>
+        <w:pStyle w:val="Heading1"/>
+        <w:rPr>
+          <w:lang w:val="pt-PT"/>
+        </w:rPr>
+      </w:pPr>
+      <w:bookmarkStart w:id="9" w:name="_dm0aih71h03z" w:colFirst="0" w:colLast="0"/>
       <w:bookmarkEnd w:id="9"/>
-      <w:r>
-        <w:rPr>
-          <w:lang w:val="pt-PT"/>
-        </w:rPr>
-        <w:lastRenderedPageBreak/>
-        <w:t>Discussão</w:t>
-      </w:r>
-    </w:p>
-    <w:p>
-      <w:pPr>
-        <w:rPr>
-          <w:lang w:val="pt-PT"/>
-        </w:rPr>
-      </w:pPr>
-      <w:r>
-        <w:rPr>
-          <w:lang w:val="pt-PT"/>
-        </w:rPr>
-        <w:t>&lt;Discutir como as alterações tiveram impacto na usabilidade da aplicação&gt;</w:t>
-      </w:r>
-    </w:p>
-    <w:p>
-      <w:pPr>
-        <w:rPr>
-          <w:lang w:val="pt-PT"/>
-        </w:rPr>
-      </w:pPr>
-      <w:r>
-        <w:rPr>
-          <w:lang w:val="pt-PT"/>
-        </w:rPr>
-        <w:t>&lt;Limitações da solução&gt;</w:t>
-      </w:r>
-    </w:p>
-    <w:p>
-      <w:pPr>
-        <w:rPr>
-          <w:lang w:val="pt-PT"/>
-        </w:rPr>
-      </w:pPr>
-      <w:r>
-        <w:rPr>
-          <w:lang w:val="pt-PT"/>
-        </w:rPr>
-        <w:t>&lt;Limitações do estudo&gt;</w:t>
-      </w:r>
-    </w:p>
-    <w:p>
-      <w:pPr>
-        <w:rPr>
-          <w:lang w:val="pt-PT"/>
-        </w:rPr>
-      </w:pPr>
-    </w:p>
-    <w:p>
-      <w:pPr>
-        <w:pStyle w:val="Ttulo1"/>
-        <w:rPr>
-          <w:lang w:val="pt-PT"/>
-        </w:rPr>
-      </w:pPr>
-      <w:bookmarkStart w:id="10" w:name="_dm0aih71h03z" w:colFirst="0" w:colLast="0"/>
-      <w:bookmarkEnd w:id="10"/>
       <w:r>
         <w:rPr>
           <w:lang w:val="pt-PT"/>
@@ -1783,18 +2690,25 @@
         <w:rPr>
           <w:lang w:val="pt-PT"/>
         </w:rPr>
-        <w:t xml:space="preserve"> através de um conjunto de alterações simples, mas orientadas para problemas observados durante a interação dos utilizadores. As modificações introduzidas tiveram como objetivo reduzir a carga cognitiva, facilitar a identificação do alvo correto e tornar a interação mais rápida e controlada, sem comprometer a eficácia. Os resultados obtidos indicam que a solução proposta contribui para um melhor desempenho, refletido sobretudo na redução dos tempos de execução e numa maior consistência na seleção dos alvos. De forma geral, este projeto mostra que pequenas decisões de design, baseadas na observação do comportamento dos utilizadores e em princípios básicos de usabilidade, podem ter um impacto relevante na qualidade da interação.</w:t>
-      </w:r>
-    </w:p>
-    <w:p>
-      <w:pPr>
-        <w:pStyle w:val="Ttulo1"/>
-        <w:rPr>
-          <w:lang w:val="pt-PT"/>
-        </w:rPr>
-      </w:pPr>
-      <w:bookmarkStart w:id="11" w:name="_4pkpdev5pskd" w:colFirst="0" w:colLast="0"/>
-      <w:bookmarkEnd w:id="11"/>
+        <w:t xml:space="preserve"> através de um conjunto de alterações simples, mas orientadas para problemas observados durante a interação dos utilizadores. As modificações introduzidas tiveram como objetivo reduzir a carga cognitiva, facilitar a identificação do alvo correto e tornar a interação mais rápida e controlada, sem comprometer a eficácia. Os resultados obtidos indicam que a solução proposta contribui para um melhor desempenho, refletido sobretudo na redução dos tempos de execução e numa maior </w:t>
+      </w:r>
+      <w:r>
+        <w:rPr>
+          <w:lang w:val="pt-PT"/>
+        </w:rPr>
+        <w:lastRenderedPageBreak/>
+        <w:t>consistência na seleção dos alvos. De forma geral, este projeto mostra que pequenas decisões de design, baseadas na observação do comportamento dos utilizadores e em princípios básicos de usabilidade, podem ter um impacto relevante na qualidade da interação.</w:t>
+      </w:r>
+    </w:p>
+    <w:p>
+      <w:pPr>
+        <w:pStyle w:val="Heading1"/>
+        <w:rPr>
+          <w:lang w:val="pt-PT"/>
+        </w:rPr>
+      </w:pPr>
+      <w:bookmarkStart w:id="10" w:name="_4pkpdev5pskd" w:colFirst="0" w:colLast="0"/>
+      <w:bookmarkEnd w:id="10"/>
       <w:r>
         <w:rPr>
           <w:lang w:val="pt-PT"/>
@@ -1835,7 +2749,7 @@
       </w:r>
       <w:r>
         <w:rPr>
-          <w:rStyle w:val="nfase"/>
+          <w:rStyle w:val="Emphasis"/>
           <w:lang w:val="en-US"/>
         </w:rPr>
         <w:t>Understanding performance in touch pointing: The effects of target visibility and cursor design</w:t>
@@ -1863,7 +2777,7 @@
       </w:r>
       <w:r>
         <w:rPr>
-          <w:rStyle w:val="nfase"/>
+          <w:rStyle w:val="Emphasis"/>
           <w:lang w:val="en-US"/>
         </w:rPr>
         <w:t>The information capacity of the human motor system in controlling the amplitude of movement</w:t>
@@ -1916,7 +2830,7 @@
       <w:proofErr w:type="spellStart"/>
       <w:r>
         <w:rPr>
-          <w:rStyle w:val="nfase"/>
+          <w:rStyle w:val="Emphasis"/>
           <w:lang w:val="en-US"/>
         </w:rPr>
         <w:t>Fitts’</w:t>
@@ -1924,7 +2838,7 @@
       <w:proofErr w:type="spellEnd"/>
       <w:r>
         <w:rPr>
-          <w:rStyle w:val="nfase"/>
+          <w:rStyle w:val="Emphasis"/>
           <w:lang w:val="en-US"/>
         </w:rPr>
         <w:t xml:space="preserve"> law as a research and design tool in human-computer interaction</w:t>
@@ -1976,7 +2890,7 @@
       </w:r>
       <w:r>
         <w:rPr>
-          <w:rStyle w:val="nfase"/>
+          <w:rStyle w:val="Emphasis"/>
           <w:lang w:val="en-US"/>
         </w:rPr>
         <w:t>The design of everyday things</w:t>
@@ -2051,7 +2965,7 @@
       </w:r>
       <w:r>
         <w:rPr>
-          <w:rStyle w:val="nfase"/>
+          <w:rStyle w:val="Emphasis"/>
           <w:lang w:val="en-US"/>
         </w:rPr>
         <w:t>Designing the user interface: Strategies for effective human-computer interaction</w:t>
@@ -2087,7 +3001,7 @@
       </w:r>
       <w:r>
         <w:rPr>
-          <w:rStyle w:val="nfase"/>
+          <w:rStyle w:val="Emphasis"/>
           <w:lang w:val="en-US"/>
         </w:rPr>
         <w:t>Information visualization: Perception for design</w:t>
@@ -2134,7 +3048,7 @@
       </w:r>
       <w:r>
         <w:rPr>
-          <w:rStyle w:val="nfase"/>
+          <w:rStyle w:val="Emphasis"/>
           <w:lang w:val="en-US"/>
         </w:rPr>
         <w:t>Cognitive load during problem solving: Effects on learning</w:t>
@@ -2181,7 +3095,7 @@
       </w:r>
       <w:r>
         <w:rPr>
-          <w:rStyle w:val="nfase"/>
+          <w:rStyle w:val="Emphasis"/>
           <w:lang w:val="en-US"/>
         </w:rPr>
         <w:t>The design of everyday things</w:t>
@@ -2220,6 +3134,155 @@
 <file path=word/numbering.xml><?xml version="1.0" encoding="utf-8"?>
 <w:numbering xmlns:wpc="http://schemas.microsoft.com/office/word/2010/wordprocessingCanvas" xmlns:cx="http://schemas.microsoft.com/office/drawing/2014/chartex" xmlns:cx1="http://schemas.microsoft.com/office/drawing/2015/9/8/chartex" xmlns:cx2="http://schemas.microsoft.com/office/drawing/2015/10/21/chartex" xmlns:cx3="http://schemas.microsoft.com/office/drawing/2016/5/9/chartex" xmlns:cx4="http://schemas.microsoft.com/office/drawing/2016/5/10/chartex" xmlns:cx5="http://schemas.microsoft.com/office/drawing/2016/5/11/chartex" xmlns:cx6="http://schemas.microsoft.com/office/drawing/2016/5/12/chartex" xmlns:cx7="http://schemas.microsoft.com/office/drawing/2016/5/13/chartex" xmlns:cx8="http://schemas.microsoft.com/office/drawing/2016/5/14/chartex" xmlns:mc="http://schemas.openxmlformats.org/markup-compatibility/2006" xmlns:aink="http://schemas.microsoft.com/office/drawing/2016/ink" xmlns:am3d="http://schemas.microsoft.com/office/drawing/2017/model3d" xmlns:o="urn:schemas-microsoft-com:office:office" xmlns:oel="http://schemas.microsoft.com/office/2019/extlst" xmlns:r="http://schemas.openxmlformats.org/officeDocument/2006/relationships" xmlns:m="http://schemas.openxmlformats.org/officeDocument/2006/math" xmlns:v="urn:schemas-microsoft-com:vml" xmlns:wp14="http://schemas.microsoft.com/office/word/2010/wordprocessingDrawing" xmlns:wp="http://schemas.openxmlformats.org/drawingml/2006/wordprocessingDrawing" xmlns:w10="urn:schemas-microsoft-com:office:word" xmlns:w="http://schemas.openxmlformats.org/wordprocessingml/2006/main" xmlns:w14="http://schemas.microsoft.com/office/word/2010/wordml" xmlns:w15="http://schemas.microsoft.com/office/word/2012/wordml" xmlns:w16cex="http://schemas.microsoft.com/office/word/2018/wordml/cex" xmlns:w16cid="http://schemas.microsoft.com/office/word/2016/wordml/cid" xmlns:w16="http://schemas.microsoft.com/office/word/2018/wordml" xmlns:w16du="http://schemas.microsoft.com/office/word/2023/wordml/word16du" xmlns:w16sdtdh="http://schemas.microsoft.com/office/word/2020/wordml/sdtdatahash" xmlns:w16sdtfl="http://schemas.microsoft.com/office/word/2024/wordml/sdtformatlock" xmlns:w16se="http://schemas.microsoft.com/office/word/2015/wordml/symex" xmlns:wpg="http://schemas.microsoft.com/office/word/2010/wordprocessingGroup" xmlns:wpi="http://schemas.microsoft.com/office/word/2010/wordprocessingInk" xmlns:wne="http://schemas.microsoft.com/office/word/2006/wordml" xmlns:wps="http://schemas.microsoft.com/office/word/2010/wordprocessingShape" mc:Ignorable="w14 w15 w16se w16cid w16 w16cex w16sdtdh w16sdtfl w16du wp14">
   <w:abstractNum w:abstractNumId="0" w15:restartNumberingAfterBreak="0">
+    <w:nsid w:val="369B1426"/>
+    <w:multiLevelType w:val="multilevel"/>
+    <w:tmpl w:val="40520670"/>
+    <w:lvl w:ilvl="0">
+      <w:start w:val="1"/>
+      <w:numFmt w:val="bullet"/>
+      <w:lvlText w:val=""/>
+      <w:lvlJc w:val="left"/>
+      <w:pPr>
+        <w:tabs>
+          <w:tab w:val="num" w:pos="720"/>
+        </w:tabs>
+        <w:ind w:left="720" w:hanging="360"/>
+      </w:pPr>
+      <w:rPr>
+        <w:rFonts w:ascii="Symbol" w:hAnsi="Symbol" w:hint="default"/>
+        <w:sz w:val="20"/>
+      </w:rPr>
+    </w:lvl>
+    <w:lvl w:ilvl="1" w:tentative="1">
+      <w:start w:val="1"/>
+      <w:numFmt w:val="bullet"/>
+      <w:lvlText w:val=""/>
+      <w:lvlJc w:val="left"/>
+      <w:pPr>
+        <w:tabs>
+          <w:tab w:val="num" w:pos="1440"/>
+        </w:tabs>
+        <w:ind w:left="1440" w:hanging="360"/>
+      </w:pPr>
+      <w:rPr>
+        <w:rFonts w:ascii="Symbol" w:hAnsi="Symbol" w:hint="default"/>
+        <w:sz w:val="20"/>
+      </w:rPr>
+    </w:lvl>
+    <w:lvl w:ilvl="2" w:tentative="1">
+      <w:start w:val="1"/>
+      <w:numFmt w:val="bullet"/>
+      <w:lvlText w:val=""/>
+      <w:lvlJc w:val="left"/>
+      <w:pPr>
+        <w:tabs>
+          <w:tab w:val="num" w:pos="2160"/>
+        </w:tabs>
+        <w:ind w:left="2160" w:hanging="360"/>
+      </w:pPr>
+      <w:rPr>
+        <w:rFonts w:ascii="Symbol" w:hAnsi="Symbol" w:hint="default"/>
+        <w:sz w:val="20"/>
+      </w:rPr>
+    </w:lvl>
+    <w:lvl w:ilvl="3" w:tentative="1">
+      <w:start w:val="1"/>
+      <w:numFmt w:val="bullet"/>
+      <w:lvlText w:val=""/>
+      <w:lvlJc w:val="left"/>
+      <w:pPr>
+        <w:tabs>
+          <w:tab w:val="num" w:pos="2880"/>
+        </w:tabs>
+        <w:ind w:left="2880" w:hanging="360"/>
+      </w:pPr>
+      <w:rPr>
+        <w:rFonts w:ascii="Symbol" w:hAnsi="Symbol" w:hint="default"/>
+        <w:sz w:val="20"/>
+      </w:rPr>
+    </w:lvl>
+    <w:lvl w:ilvl="4" w:tentative="1">
+      <w:start w:val="1"/>
+      <w:numFmt w:val="bullet"/>
+      <w:lvlText w:val=""/>
+      <w:lvlJc w:val="left"/>
+      <w:pPr>
+        <w:tabs>
+          <w:tab w:val="num" w:pos="3600"/>
+        </w:tabs>
+        <w:ind w:left="3600" w:hanging="360"/>
+      </w:pPr>
+      <w:rPr>
+        <w:rFonts w:ascii="Symbol" w:hAnsi="Symbol" w:hint="default"/>
+        <w:sz w:val="20"/>
+      </w:rPr>
+    </w:lvl>
+    <w:lvl w:ilvl="5" w:tentative="1">
+      <w:start w:val="1"/>
+      <w:numFmt w:val="bullet"/>
+      <w:lvlText w:val=""/>
+      <w:lvlJc w:val="left"/>
+      <w:pPr>
+        <w:tabs>
+          <w:tab w:val="num" w:pos="4320"/>
+        </w:tabs>
+        <w:ind w:left="4320" w:hanging="360"/>
+      </w:pPr>
+      <w:rPr>
+        <w:rFonts w:ascii="Symbol" w:hAnsi="Symbol" w:hint="default"/>
+        <w:sz w:val="20"/>
+      </w:rPr>
+    </w:lvl>
+    <w:lvl w:ilvl="6" w:tentative="1">
+      <w:start w:val="1"/>
+      <w:numFmt w:val="bullet"/>
+      <w:lvlText w:val=""/>
+      <w:lvlJc w:val="left"/>
+      <w:pPr>
+        <w:tabs>
+          <w:tab w:val="num" w:pos="5040"/>
+        </w:tabs>
+        <w:ind w:left="5040" w:hanging="360"/>
+      </w:pPr>
+      <w:rPr>
+        <w:rFonts w:ascii="Symbol" w:hAnsi="Symbol" w:hint="default"/>
+        <w:sz w:val="20"/>
+      </w:rPr>
+    </w:lvl>
+    <w:lvl w:ilvl="7" w:tentative="1">
+      <w:start w:val="1"/>
+      <w:numFmt w:val="bullet"/>
+      <w:lvlText w:val=""/>
+      <w:lvlJc w:val="left"/>
+      <w:pPr>
+        <w:tabs>
+          <w:tab w:val="num" w:pos="5760"/>
+        </w:tabs>
+        <w:ind w:left="5760" w:hanging="360"/>
+      </w:pPr>
+      <w:rPr>
+        <w:rFonts w:ascii="Symbol" w:hAnsi="Symbol" w:hint="default"/>
+        <w:sz w:val="20"/>
+      </w:rPr>
+    </w:lvl>
+    <w:lvl w:ilvl="8" w:tentative="1">
+      <w:start w:val="1"/>
+      <w:numFmt w:val="bullet"/>
+      <w:lvlText w:val=""/>
+      <w:lvlJc w:val="left"/>
+      <w:pPr>
+        <w:tabs>
+          <w:tab w:val="num" w:pos="6480"/>
+        </w:tabs>
+        <w:ind w:left="6480" w:hanging="360"/>
+      </w:pPr>
+      <w:rPr>
+        <w:rFonts w:ascii="Symbol" w:hAnsi="Symbol" w:hint="default"/>
+        <w:sz w:val="20"/>
+      </w:rPr>
+    </w:lvl>
+  </w:abstractNum>
+  <w:abstractNum w:abstractNumId="1" w15:restartNumberingAfterBreak="0">
     <w:nsid w:val="3ECA0177"/>
     <w:multiLevelType w:val="multilevel"/>
     <w:tmpl w:val="A6C0C2C0"/>
@@ -2332,8 +3395,279 @@
       </w:rPr>
     </w:lvl>
   </w:abstractNum>
+  <w:abstractNum w:abstractNumId="2" w15:restartNumberingAfterBreak="0">
+    <w:nsid w:val="459D516E"/>
+    <w:multiLevelType w:val="hybridMultilevel"/>
+    <w:tmpl w:val="7212ABBC"/>
+    <w:lvl w:ilvl="0" w:tplc="04090001">
+      <w:start w:val="1"/>
+      <w:numFmt w:val="bullet"/>
+      <w:lvlText w:val=""/>
+      <w:lvlJc w:val="left"/>
+      <w:pPr>
+        <w:ind w:left="720" w:hanging="360"/>
+      </w:pPr>
+      <w:rPr>
+        <w:rFonts w:ascii="Symbol" w:hAnsi="Symbol" w:hint="default"/>
+      </w:rPr>
+    </w:lvl>
+    <w:lvl w:ilvl="1" w:tplc="04090003" w:tentative="1">
+      <w:start w:val="1"/>
+      <w:numFmt w:val="bullet"/>
+      <w:lvlText w:val="o"/>
+      <w:lvlJc w:val="left"/>
+      <w:pPr>
+        <w:ind w:left="1440" w:hanging="360"/>
+      </w:pPr>
+      <w:rPr>
+        <w:rFonts w:ascii="Courier New" w:hAnsi="Courier New" w:cs="Courier New" w:hint="default"/>
+      </w:rPr>
+    </w:lvl>
+    <w:lvl w:ilvl="2" w:tplc="04090005" w:tentative="1">
+      <w:start w:val="1"/>
+      <w:numFmt w:val="bullet"/>
+      <w:lvlText w:val=""/>
+      <w:lvlJc w:val="left"/>
+      <w:pPr>
+        <w:ind w:left="2160" w:hanging="360"/>
+      </w:pPr>
+      <w:rPr>
+        <w:rFonts w:ascii="Wingdings" w:hAnsi="Wingdings" w:hint="default"/>
+      </w:rPr>
+    </w:lvl>
+    <w:lvl w:ilvl="3" w:tplc="04090001" w:tentative="1">
+      <w:start w:val="1"/>
+      <w:numFmt w:val="bullet"/>
+      <w:lvlText w:val=""/>
+      <w:lvlJc w:val="left"/>
+      <w:pPr>
+        <w:ind w:left="2880" w:hanging="360"/>
+      </w:pPr>
+      <w:rPr>
+        <w:rFonts w:ascii="Symbol" w:hAnsi="Symbol" w:hint="default"/>
+      </w:rPr>
+    </w:lvl>
+    <w:lvl w:ilvl="4" w:tplc="04090003" w:tentative="1">
+      <w:start w:val="1"/>
+      <w:numFmt w:val="bullet"/>
+      <w:lvlText w:val="o"/>
+      <w:lvlJc w:val="left"/>
+      <w:pPr>
+        <w:ind w:left="3600" w:hanging="360"/>
+      </w:pPr>
+      <w:rPr>
+        <w:rFonts w:ascii="Courier New" w:hAnsi="Courier New" w:cs="Courier New" w:hint="default"/>
+      </w:rPr>
+    </w:lvl>
+    <w:lvl w:ilvl="5" w:tplc="04090005" w:tentative="1">
+      <w:start w:val="1"/>
+      <w:numFmt w:val="bullet"/>
+      <w:lvlText w:val=""/>
+      <w:lvlJc w:val="left"/>
+      <w:pPr>
+        <w:ind w:left="4320" w:hanging="360"/>
+      </w:pPr>
+      <w:rPr>
+        <w:rFonts w:ascii="Wingdings" w:hAnsi="Wingdings" w:hint="default"/>
+      </w:rPr>
+    </w:lvl>
+    <w:lvl w:ilvl="6" w:tplc="04090001" w:tentative="1">
+      <w:start w:val="1"/>
+      <w:numFmt w:val="bullet"/>
+      <w:lvlText w:val=""/>
+      <w:lvlJc w:val="left"/>
+      <w:pPr>
+        <w:ind w:left="5040" w:hanging="360"/>
+      </w:pPr>
+      <w:rPr>
+        <w:rFonts w:ascii="Symbol" w:hAnsi="Symbol" w:hint="default"/>
+      </w:rPr>
+    </w:lvl>
+    <w:lvl w:ilvl="7" w:tplc="04090003" w:tentative="1">
+      <w:start w:val="1"/>
+      <w:numFmt w:val="bullet"/>
+      <w:lvlText w:val="o"/>
+      <w:lvlJc w:val="left"/>
+      <w:pPr>
+        <w:ind w:left="5760" w:hanging="360"/>
+      </w:pPr>
+      <w:rPr>
+        <w:rFonts w:ascii="Courier New" w:hAnsi="Courier New" w:cs="Courier New" w:hint="default"/>
+      </w:rPr>
+    </w:lvl>
+    <w:lvl w:ilvl="8" w:tplc="04090005" w:tentative="1">
+      <w:start w:val="1"/>
+      <w:numFmt w:val="bullet"/>
+      <w:lvlText w:val=""/>
+      <w:lvlJc w:val="left"/>
+      <w:pPr>
+        <w:ind w:left="6480" w:hanging="360"/>
+      </w:pPr>
+      <w:rPr>
+        <w:rFonts w:ascii="Wingdings" w:hAnsi="Wingdings" w:hint="default"/>
+      </w:rPr>
+    </w:lvl>
+  </w:abstractNum>
+  <w:abstractNum w:abstractNumId="3" w15:restartNumberingAfterBreak="0">
+    <w:nsid w:val="5DB1131B"/>
+    <w:multiLevelType w:val="multilevel"/>
+    <w:tmpl w:val="66A2D728"/>
+    <w:lvl w:ilvl="0">
+      <w:start w:val="1"/>
+      <w:numFmt w:val="bullet"/>
+      <w:lvlText w:val=""/>
+      <w:lvlJc w:val="left"/>
+      <w:pPr>
+        <w:tabs>
+          <w:tab w:val="num" w:pos="720"/>
+        </w:tabs>
+        <w:ind w:left="720" w:hanging="360"/>
+      </w:pPr>
+      <w:rPr>
+        <w:rFonts w:ascii="Symbol" w:hAnsi="Symbol" w:hint="default"/>
+        <w:sz w:val="20"/>
+      </w:rPr>
+    </w:lvl>
+    <w:lvl w:ilvl="1" w:tentative="1">
+      <w:start w:val="1"/>
+      <w:numFmt w:val="bullet"/>
+      <w:lvlText w:val=""/>
+      <w:lvlJc w:val="left"/>
+      <w:pPr>
+        <w:tabs>
+          <w:tab w:val="num" w:pos="1440"/>
+        </w:tabs>
+        <w:ind w:left="1440" w:hanging="360"/>
+      </w:pPr>
+      <w:rPr>
+        <w:rFonts w:ascii="Symbol" w:hAnsi="Symbol" w:hint="default"/>
+        <w:sz w:val="20"/>
+      </w:rPr>
+    </w:lvl>
+    <w:lvl w:ilvl="2" w:tentative="1">
+      <w:start w:val="1"/>
+      <w:numFmt w:val="bullet"/>
+      <w:lvlText w:val=""/>
+      <w:lvlJc w:val="left"/>
+      <w:pPr>
+        <w:tabs>
+          <w:tab w:val="num" w:pos="2160"/>
+        </w:tabs>
+        <w:ind w:left="2160" w:hanging="360"/>
+      </w:pPr>
+      <w:rPr>
+        <w:rFonts w:ascii="Symbol" w:hAnsi="Symbol" w:hint="default"/>
+        <w:sz w:val="20"/>
+      </w:rPr>
+    </w:lvl>
+    <w:lvl w:ilvl="3" w:tentative="1">
+      <w:start w:val="1"/>
+      <w:numFmt w:val="bullet"/>
+      <w:lvlText w:val=""/>
+      <w:lvlJc w:val="left"/>
+      <w:pPr>
+        <w:tabs>
+          <w:tab w:val="num" w:pos="2880"/>
+        </w:tabs>
+        <w:ind w:left="2880" w:hanging="360"/>
+      </w:pPr>
+      <w:rPr>
+        <w:rFonts w:ascii="Symbol" w:hAnsi="Symbol" w:hint="default"/>
+        <w:sz w:val="20"/>
+      </w:rPr>
+    </w:lvl>
+    <w:lvl w:ilvl="4" w:tentative="1">
+      <w:start w:val="1"/>
+      <w:numFmt w:val="bullet"/>
+      <w:lvlText w:val=""/>
+      <w:lvlJc w:val="left"/>
+      <w:pPr>
+        <w:tabs>
+          <w:tab w:val="num" w:pos="3600"/>
+        </w:tabs>
+        <w:ind w:left="3600" w:hanging="360"/>
+      </w:pPr>
+      <w:rPr>
+        <w:rFonts w:ascii="Symbol" w:hAnsi="Symbol" w:hint="default"/>
+        <w:sz w:val="20"/>
+      </w:rPr>
+    </w:lvl>
+    <w:lvl w:ilvl="5" w:tentative="1">
+      <w:start w:val="1"/>
+      <w:numFmt w:val="bullet"/>
+      <w:lvlText w:val=""/>
+      <w:lvlJc w:val="left"/>
+      <w:pPr>
+        <w:tabs>
+          <w:tab w:val="num" w:pos="4320"/>
+        </w:tabs>
+        <w:ind w:left="4320" w:hanging="360"/>
+      </w:pPr>
+      <w:rPr>
+        <w:rFonts w:ascii="Symbol" w:hAnsi="Symbol" w:hint="default"/>
+        <w:sz w:val="20"/>
+      </w:rPr>
+    </w:lvl>
+    <w:lvl w:ilvl="6" w:tentative="1">
+      <w:start w:val="1"/>
+      <w:numFmt w:val="bullet"/>
+      <w:lvlText w:val=""/>
+      <w:lvlJc w:val="left"/>
+      <w:pPr>
+        <w:tabs>
+          <w:tab w:val="num" w:pos="5040"/>
+        </w:tabs>
+        <w:ind w:left="5040" w:hanging="360"/>
+      </w:pPr>
+      <w:rPr>
+        <w:rFonts w:ascii="Symbol" w:hAnsi="Symbol" w:hint="default"/>
+        <w:sz w:val="20"/>
+      </w:rPr>
+    </w:lvl>
+    <w:lvl w:ilvl="7" w:tentative="1">
+      <w:start w:val="1"/>
+      <w:numFmt w:val="bullet"/>
+      <w:lvlText w:val=""/>
+      <w:lvlJc w:val="left"/>
+      <w:pPr>
+        <w:tabs>
+          <w:tab w:val="num" w:pos="5760"/>
+        </w:tabs>
+        <w:ind w:left="5760" w:hanging="360"/>
+      </w:pPr>
+      <w:rPr>
+        <w:rFonts w:ascii="Symbol" w:hAnsi="Symbol" w:hint="default"/>
+        <w:sz w:val="20"/>
+      </w:rPr>
+    </w:lvl>
+    <w:lvl w:ilvl="8" w:tentative="1">
+      <w:start w:val="1"/>
+      <w:numFmt w:val="bullet"/>
+      <w:lvlText w:val=""/>
+      <w:lvlJc w:val="left"/>
+      <w:pPr>
+        <w:tabs>
+          <w:tab w:val="num" w:pos="6480"/>
+        </w:tabs>
+        <w:ind w:left="6480" w:hanging="360"/>
+      </w:pPr>
+      <w:rPr>
+        <w:rFonts w:ascii="Symbol" w:hAnsi="Symbol" w:hint="default"/>
+        <w:sz w:val="20"/>
+      </w:rPr>
+    </w:lvl>
+  </w:abstractNum>
   <w:num w:numId="1" w16cid:durableId="1051729613">
+    <w:abstractNumId w:val="1"/>
+  </w:num>
+  <w:num w:numId="2" w16cid:durableId="505242686">
     <w:abstractNumId w:val="0"/>
+  </w:num>
+  <w:num w:numId="3" w16cid:durableId="1845316825">
+    <w:abstractNumId w:val="3"/>
+  </w:num>
+  <w:num w:numId="4" w16cid:durableId="2089184248">
+    <w:abstractNumId w:val="2"/>
   </w:num>
 </w:numbering>
 </file>
@@ -2737,7 +4071,7 @@
     <w:name w:val="Normal"/>
     <w:qFormat/>
   </w:style>
-  <w:style w:type="paragraph" w:styleId="Ttulo1">
+  <w:style w:type="paragraph" w:styleId="Heading1">
     <w:name w:val="heading 1"/>
     <w:basedOn w:val="Normal"/>
     <w:next w:val="Normal"/>
@@ -2754,11 +4088,11 @@
       <w:szCs w:val="40"/>
     </w:rPr>
   </w:style>
-  <w:style w:type="paragraph" w:styleId="Ttulo2">
+  <w:style w:type="paragraph" w:styleId="Heading2">
     <w:name w:val="heading 2"/>
     <w:basedOn w:val="Normal"/>
     <w:next w:val="Normal"/>
-    <w:link w:val="Ttulo2Carter"/>
+    <w:link w:val="Heading2Char"/>
     <w:uiPriority w:val="9"/>
     <w:unhideWhenUsed/>
     <w:qFormat/>
@@ -2773,7 +4107,7 @@
       <w:szCs w:val="32"/>
     </w:rPr>
   </w:style>
-  <w:style w:type="paragraph" w:styleId="Ttulo3">
+  <w:style w:type="paragraph" w:styleId="Heading3">
     <w:name w:val="heading 3"/>
     <w:basedOn w:val="Normal"/>
     <w:next w:val="Normal"/>
@@ -2793,7 +4127,7 @@
       <w:szCs w:val="28"/>
     </w:rPr>
   </w:style>
-  <w:style w:type="paragraph" w:styleId="Ttulo4">
+  <w:style w:type="paragraph" w:styleId="Heading4">
     <w:name w:val="heading 4"/>
     <w:basedOn w:val="Normal"/>
     <w:next w:val="Normal"/>
@@ -2813,7 +4147,7 @@
       <w:szCs w:val="24"/>
     </w:rPr>
   </w:style>
-  <w:style w:type="paragraph" w:styleId="Ttulo5">
+  <w:style w:type="paragraph" w:styleId="Heading5">
     <w:name w:val="heading 5"/>
     <w:basedOn w:val="Normal"/>
     <w:next w:val="Normal"/>
@@ -2831,7 +4165,7 @@
       <w:color w:val="666666"/>
     </w:rPr>
   </w:style>
-  <w:style w:type="paragraph" w:styleId="Ttulo6">
+  <w:style w:type="paragraph" w:styleId="Heading6">
     <w:name w:val="heading 6"/>
     <w:basedOn w:val="Normal"/>
     <w:next w:val="Normal"/>
@@ -2850,12 +4184,12 @@
       <w:color w:val="666666"/>
     </w:rPr>
   </w:style>
-  <w:style w:type="character" w:default="1" w:styleId="Tipodeletrapredefinidodopargrafo">
+  <w:style w:type="character" w:default="1" w:styleId="DefaultParagraphFont">
     <w:name w:val="Default Paragraph Font"/>
     <w:uiPriority w:val="1"/>
     <w:unhideWhenUsed/>
   </w:style>
-  <w:style w:type="table" w:default="1" w:styleId="Tabelanormal">
+  <w:style w:type="table" w:default="1" w:styleId="TableNormal">
     <w:name w:val="Normal Table"/>
     <w:uiPriority w:val="99"/>
     <w:semiHidden/>
@@ -2870,14 +4204,14 @@
       </w:tblCellMar>
     </w:tblPr>
   </w:style>
-  <w:style w:type="numbering" w:default="1" w:styleId="Semlista">
+  <w:style w:type="numbering" w:default="1" w:styleId="NoList">
     <w:name w:val="No List"/>
     <w:uiPriority w:val="99"/>
     <w:semiHidden/>
     <w:unhideWhenUsed/>
   </w:style>
-  <w:style w:type="table" w:customStyle="1" w:styleId="TableNormal">
-    <w:name w:val="Table Normal"/>
+  <w:style w:type="table" w:customStyle="1" w:styleId="TableNormal1">
+    <w:name w:val="Table Normal1"/>
     <w:tblPr>
       <w:tblCellMar>
         <w:top w:w="0" w:type="dxa"/>
@@ -2887,7 +4221,7 @@
       </w:tblCellMar>
     </w:tblPr>
   </w:style>
-  <w:style w:type="paragraph" w:styleId="Ttulo">
+  <w:style w:type="paragraph" w:styleId="Title">
     <w:name w:val="Title"/>
     <w:basedOn w:val="Normal"/>
     <w:next w:val="Normal"/>
@@ -2903,7 +4237,7 @@
       <w:szCs w:val="52"/>
     </w:rPr>
   </w:style>
-  <w:style w:type="paragraph" w:styleId="Subttulo">
+  <w:style w:type="paragraph" w:styleId="Subtitle">
     <w:name w:val="Subtitle"/>
     <w:basedOn w:val="Normal"/>
     <w:next w:val="Normal"/>
@@ -2920,10 +4254,10 @@
       <w:szCs w:val="30"/>
     </w:rPr>
   </w:style>
-  <w:style w:type="character" w:customStyle="1" w:styleId="Ttulo2Carter">
-    <w:name w:val="Título 2 Caráter"/>
-    <w:basedOn w:val="Tipodeletrapredefinidodopargrafo"/>
-    <w:link w:val="Ttulo2"/>
+  <w:style w:type="character" w:customStyle="1" w:styleId="Heading2Char">
+    <w:name w:val="Heading 2 Char"/>
+    <w:basedOn w:val="DefaultParagraphFont"/>
+    <w:link w:val="Heading2"/>
     <w:uiPriority w:val="9"/>
     <w:rsid w:val="009C3EC5"/>
     <w:rPr>
@@ -2947,9 +4281,9 @@
       <w:lang w:val="pt-PT"/>
     </w:rPr>
   </w:style>
-  <w:style w:type="character" w:styleId="nfase">
+  <w:style w:type="character" w:styleId="Emphasis">
     <w:name w:val="Emphasis"/>
-    <w:basedOn w:val="Tipodeletrapredefinidodopargrafo"/>
+    <w:basedOn w:val="DefaultParagraphFont"/>
     <w:uiPriority w:val="20"/>
     <w:qFormat/>
     <w:rsid w:val="00EF40C6"/>
@@ -2958,9 +4292,9 @@
       <w:iCs/>
     </w:rPr>
   </w:style>
-  <w:style w:type="character" w:styleId="Hiperligao">
+  <w:style w:type="character" w:styleId="Hyperlink">
     <w:name w:val="Hyperlink"/>
-    <w:basedOn w:val="Tipodeletrapredefinidodopargrafo"/>
+    <w:basedOn w:val="DefaultParagraphFont"/>
     <w:uiPriority w:val="99"/>
     <w:semiHidden/>
     <w:unhideWhenUsed/>
@@ -2969,6 +4303,17 @@
       <w:color w:val="0000FF"/>
       <w:u w:val="single"/>
     </w:rPr>
+  </w:style>
+  <w:style w:type="paragraph" w:styleId="ListParagraph">
+    <w:name w:val="List Paragraph"/>
+    <w:basedOn w:val="Normal"/>
+    <w:uiPriority w:val="34"/>
+    <w:qFormat/>
+    <w:rsid w:val="004043BB"/>
+    <w:pPr>
+      <w:ind w:left="720"/>
+      <w:contextualSpacing/>
+    </w:pPr>
   </w:style>
 </w:styles>
 </file>

</xml_diff>

<commit_message>
Adicionados os gráficos ao relatório final
</commit_message>
<xml_diff>
--- a/Projeto B - Relatório.docx
+++ b/Projeto B - Relatório.docx
@@ -2036,6 +2036,73 @@
       </w:pPr>
       <w:r>
         <w:rPr>
+          <w:noProof/>
+        </w:rPr>
+        <w:drawing>
+          <wp:anchor distT="0" distB="0" distL="114300" distR="114300" simplePos="0" relativeHeight="251658240" behindDoc="1" locked="0" layoutInCell="1" allowOverlap="1" wp14:anchorId="5D6A13E5" wp14:editId="4F0B235E">
+            <wp:simplePos x="0" y="0"/>
+            <wp:positionH relativeFrom="margin">
+              <wp:align>right</wp:align>
+            </wp:positionH>
+            <wp:positionV relativeFrom="margin">
+              <wp:posOffset>3104515</wp:posOffset>
+            </wp:positionV>
+            <wp:extent cx="6122035" cy="3822065"/>
+            <wp:effectExtent l="0" t="0" r="0" b="6985"/>
+            <wp:wrapTopAndBottom/>
+            <wp:docPr id="521945947" name="Picture 2"/>
+            <wp:cNvGraphicFramePr>
+              <a:graphicFrameLocks xmlns:a="http://schemas.openxmlformats.org/drawingml/2006/main" noChangeAspect="1"/>
+            </wp:cNvGraphicFramePr>
+            <a:graphic xmlns:a="http://schemas.openxmlformats.org/drawingml/2006/main">
+              <a:graphicData uri="http://schemas.openxmlformats.org/drawingml/2006/picture">
+                <pic:pic xmlns:pic="http://schemas.openxmlformats.org/drawingml/2006/picture">
+                  <pic:nvPicPr>
+                    <pic:cNvPr id="0" name="Picture 2"/>
+                    <pic:cNvPicPr>
+                      <a:picLocks noChangeAspect="1" noChangeArrowheads="1"/>
+                    </pic:cNvPicPr>
+                  </pic:nvPicPr>
+                  <pic:blipFill>
+                    <a:blip r:embed="rId5">
+                      <a:extLst>
+                        <a:ext uri="{28A0092B-C50C-407E-A947-70E740481C1C}">
+                          <a14:useLocalDpi xmlns:a14="http://schemas.microsoft.com/office/drawing/2010/main" val="0"/>
+                        </a:ext>
+                      </a:extLst>
+                    </a:blip>
+                    <a:srcRect/>
+                    <a:stretch>
+                      <a:fillRect/>
+                    </a:stretch>
+                  </pic:blipFill>
+                  <pic:spPr bwMode="auto">
+                    <a:xfrm>
+                      <a:off x="0" y="0"/>
+                      <a:ext cx="6122035" cy="3822065"/>
+                    </a:xfrm>
+                    <a:prstGeom prst="rect">
+                      <a:avLst/>
+                    </a:prstGeom>
+                    <a:noFill/>
+                    <a:ln>
+                      <a:noFill/>
+                    </a:ln>
+                  </pic:spPr>
+                </pic:pic>
+              </a:graphicData>
+            </a:graphic>
+            <wp14:sizeRelH relativeFrom="margin">
+              <wp14:pctWidth>0</wp14:pctWidth>
+            </wp14:sizeRelH>
+            <wp14:sizeRelV relativeFrom="margin">
+              <wp14:pctHeight>0</wp14:pctHeight>
+            </wp14:sizeRelV>
+          </wp:anchor>
+        </w:drawing>
+      </w:r>
+      <w:r>
+        <w:rPr>
           <w:sz w:val="22"/>
           <w:szCs w:val="22"/>
           <w:lang w:val="pt-PT"/>
@@ -2086,6 +2153,67 @@
     </w:p>
     <w:p>
       <w:pPr>
+        <w:rPr>
+          <w:lang w:val="pt-PT"/>
+        </w:rPr>
+      </w:pPr>
+      <w:r>
+        <w:rPr>
+          <w:noProof/>
+        </w:rPr>
+        <w:lastRenderedPageBreak/>
+        <w:drawing>
+          <wp:inline distT="0" distB="0" distL="0" distR="0" wp14:anchorId="18D8D438" wp14:editId="251AEEE1">
+            <wp:extent cx="6121400" cy="3498215"/>
+            <wp:effectExtent l="0" t="0" r="0" b="6985"/>
+            <wp:docPr id="1100175943" name="Picture 3"/>
+            <wp:cNvGraphicFramePr>
+              <a:graphicFrameLocks xmlns:a="http://schemas.openxmlformats.org/drawingml/2006/main" noChangeAspect="1"/>
+            </wp:cNvGraphicFramePr>
+            <a:graphic xmlns:a="http://schemas.openxmlformats.org/drawingml/2006/main">
+              <a:graphicData uri="http://schemas.openxmlformats.org/drawingml/2006/picture">
+                <pic:pic xmlns:pic="http://schemas.openxmlformats.org/drawingml/2006/picture">
+                  <pic:nvPicPr>
+                    <pic:cNvPr id="0" name="Picture 4"/>
+                    <pic:cNvPicPr>
+                      <a:picLocks noChangeAspect="1" noChangeArrowheads="1"/>
+                    </pic:cNvPicPr>
+                  </pic:nvPicPr>
+                  <pic:blipFill>
+                    <a:blip r:embed="rId6">
+                      <a:extLst>
+                        <a:ext uri="{28A0092B-C50C-407E-A947-70E740481C1C}">
+                          <a14:useLocalDpi xmlns:a14="http://schemas.microsoft.com/office/drawing/2010/main" val="0"/>
+                        </a:ext>
+                      </a:extLst>
+                    </a:blip>
+                    <a:srcRect/>
+                    <a:stretch>
+                      <a:fillRect/>
+                    </a:stretch>
+                  </pic:blipFill>
+                  <pic:spPr bwMode="auto">
+                    <a:xfrm>
+                      <a:off x="0" y="0"/>
+                      <a:ext cx="6121400" cy="3498215"/>
+                    </a:xfrm>
+                    <a:prstGeom prst="rect">
+                      <a:avLst/>
+                    </a:prstGeom>
+                    <a:noFill/>
+                    <a:ln>
+                      <a:noFill/>
+                    </a:ln>
+                  </pic:spPr>
+                </pic:pic>
+              </a:graphicData>
+            </a:graphic>
+          </wp:inline>
+        </w:drawing>
+      </w:r>
+    </w:p>
+    <w:p>
+      <w:pPr>
         <w:pStyle w:val="Heading1"/>
         <w:numPr>
           <w:ilvl w:val="0"/>
@@ -2145,6 +2273,66 @@
     </w:p>
     <w:p>
       <w:pPr>
+        <w:rPr>
+          <w:lang w:val="pt-PT"/>
+        </w:rPr>
+      </w:pPr>
+      <w:r>
+        <w:rPr>
+          <w:noProof/>
+        </w:rPr>
+        <w:drawing>
+          <wp:inline distT="0" distB="0" distL="0" distR="0" wp14:anchorId="07E1772C" wp14:editId="03492D86">
+            <wp:extent cx="6121400" cy="3498215"/>
+            <wp:effectExtent l="0" t="0" r="0" b="6985"/>
+            <wp:docPr id="1695637366" name="Picture 4"/>
+            <wp:cNvGraphicFramePr>
+              <a:graphicFrameLocks xmlns:a="http://schemas.openxmlformats.org/drawingml/2006/main" noChangeAspect="1"/>
+            </wp:cNvGraphicFramePr>
+            <a:graphic xmlns:a="http://schemas.openxmlformats.org/drawingml/2006/main">
+              <a:graphicData uri="http://schemas.openxmlformats.org/drawingml/2006/picture">
+                <pic:pic xmlns:pic="http://schemas.openxmlformats.org/drawingml/2006/picture">
+                  <pic:nvPicPr>
+                    <pic:cNvPr id="0" name="Picture 6"/>
+                    <pic:cNvPicPr>
+                      <a:picLocks noChangeAspect="1" noChangeArrowheads="1"/>
+                    </pic:cNvPicPr>
+                  </pic:nvPicPr>
+                  <pic:blipFill>
+                    <a:blip r:embed="rId7">
+                      <a:extLst>
+                        <a:ext uri="{28A0092B-C50C-407E-A947-70E740481C1C}">
+                          <a14:useLocalDpi xmlns:a14="http://schemas.microsoft.com/office/drawing/2010/main" val="0"/>
+                        </a:ext>
+                      </a:extLst>
+                    </a:blip>
+                    <a:srcRect/>
+                    <a:stretch>
+                      <a:fillRect/>
+                    </a:stretch>
+                  </pic:blipFill>
+                  <pic:spPr bwMode="auto">
+                    <a:xfrm>
+                      <a:off x="0" y="0"/>
+                      <a:ext cx="6121400" cy="3498215"/>
+                    </a:xfrm>
+                    <a:prstGeom prst="rect">
+                      <a:avLst/>
+                    </a:prstGeom>
+                    <a:noFill/>
+                    <a:ln>
+                      <a:noFill/>
+                    </a:ln>
+                  </pic:spPr>
+                </pic:pic>
+              </a:graphicData>
+            </a:graphic>
+          </wp:inline>
+        </w:drawing>
+      </w:r>
+    </w:p>
+    <w:p>
+      <w:pPr>
         <w:pStyle w:val="Heading1"/>
         <w:numPr>
           <w:ilvl w:val="0"/>
@@ -2162,6 +2350,7 @@
           <w:szCs w:val="22"/>
           <w:lang w:val="pt-PT"/>
         </w:rPr>
+        <w:lastRenderedPageBreak/>
         <w:t>Erros totais (</w:t>
       </w:r>
       <w:proofErr w:type="spellStart"/>
@@ -2220,6 +2409,80 @@
         </w:rPr>
         <w:t>De forma geral, os resultados indicam que a solução proposta melhora significativamente a eficiência da tarefa sem prejuízo da eficácia.</w:t>
       </w:r>
+    </w:p>
+    <w:p>
+      <w:pPr>
+        <w:rPr>
+          <w:lang w:val="pt-PT"/>
+        </w:rPr>
+      </w:pPr>
+    </w:p>
+    <w:p>
+      <w:pPr>
+        <w:rPr>
+          <w:lang w:val="pt-PT"/>
+        </w:rPr>
+      </w:pPr>
+      <w:r>
+        <w:rPr>
+          <w:noProof/>
+        </w:rPr>
+        <w:drawing>
+          <wp:inline distT="0" distB="0" distL="0" distR="0" wp14:anchorId="10201911" wp14:editId="0BFBD8F2">
+            <wp:extent cx="6121400" cy="3498215"/>
+            <wp:effectExtent l="0" t="0" r="0" b="6985"/>
+            <wp:docPr id="1935923490" name="Picture 5"/>
+            <wp:cNvGraphicFramePr>
+              <a:graphicFrameLocks xmlns:a="http://schemas.openxmlformats.org/drawingml/2006/main" noChangeAspect="1"/>
+            </wp:cNvGraphicFramePr>
+            <a:graphic xmlns:a="http://schemas.openxmlformats.org/drawingml/2006/main">
+              <a:graphicData uri="http://schemas.openxmlformats.org/drawingml/2006/picture">
+                <pic:pic xmlns:pic="http://schemas.openxmlformats.org/drawingml/2006/picture">
+                  <pic:nvPicPr>
+                    <pic:cNvPr id="0" name="Picture 8"/>
+                    <pic:cNvPicPr>
+                      <a:picLocks noChangeAspect="1" noChangeArrowheads="1"/>
+                    </pic:cNvPicPr>
+                  </pic:nvPicPr>
+                  <pic:blipFill>
+                    <a:blip r:embed="rId8">
+                      <a:extLst>
+                        <a:ext uri="{28A0092B-C50C-407E-A947-70E740481C1C}">
+                          <a14:useLocalDpi xmlns:a14="http://schemas.microsoft.com/office/drawing/2010/main" val="0"/>
+                        </a:ext>
+                      </a:extLst>
+                    </a:blip>
+                    <a:srcRect/>
+                    <a:stretch>
+                      <a:fillRect/>
+                    </a:stretch>
+                  </pic:blipFill>
+                  <pic:spPr bwMode="auto">
+                    <a:xfrm>
+                      <a:off x="0" y="0"/>
+                      <a:ext cx="6121400" cy="3498215"/>
+                    </a:xfrm>
+                    <a:prstGeom prst="rect">
+                      <a:avLst/>
+                    </a:prstGeom>
+                    <a:noFill/>
+                    <a:ln>
+                      <a:noFill/>
+                    </a:ln>
+                  </pic:spPr>
+                </pic:pic>
+              </a:graphicData>
+            </a:graphic>
+          </wp:inline>
+        </w:drawing>
+      </w:r>
+    </w:p>
+    <w:p>
+      <w:pPr>
+        <w:rPr>
+          <w:lang w:val="pt-PT"/>
+        </w:rPr>
+      </w:pPr>
     </w:p>
     <w:p>
       <w:pPr>
@@ -2303,6 +2566,136 @@
     </w:p>
     <w:p>
       <w:pPr>
+        <w:rPr>
+          <w:lang w:val="pt-PT"/>
+        </w:rPr>
+      </w:pPr>
+      <w:r>
+        <w:rPr>
+          <w:noProof/>
+          <w:lang w:val="pt-PT"/>
+        </w:rPr>
+        <w:lastRenderedPageBreak/>
+        <w:drawing>
+          <wp:inline distT="0" distB="0" distL="0" distR="0" wp14:anchorId="54EEF941" wp14:editId="7E59E97F">
+            <wp:extent cx="6122670" cy="3498849"/>
+            <wp:effectExtent l="0" t="0" r="0" b="6985"/>
+            <wp:docPr id="566181711" name="Picture 6"/>
+            <wp:cNvGraphicFramePr>
+              <a:graphicFrameLocks xmlns:a="http://schemas.openxmlformats.org/drawingml/2006/main" noChangeAspect="1"/>
+            </wp:cNvGraphicFramePr>
+            <a:graphic xmlns:a="http://schemas.openxmlformats.org/drawingml/2006/main">
+              <a:graphicData uri="http://schemas.openxmlformats.org/drawingml/2006/picture">
+                <pic:pic xmlns:pic="http://schemas.openxmlformats.org/drawingml/2006/picture">
+                  <pic:nvPicPr>
+                    <pic:cNvPr id="0" name="Picture 10"/>
+                    <pic:cNvPicPr>
+                      <a:picLocks noChangeAspect="1" noChangeArrowheads="1"/>
+                    </pic:cNvPicPr>
+                  </pic:nvPicPr>
+                  <pic:blipFill>
+                    <a:blip r:embed="rId9">
+                      <a:extLst>
+                        <a:ext uri="{28A0092B-C50C-407E-A947-70E740481C1C}">
+                          <a14:useLocalDpi xmlns:a14="http://schemas.microsoft.com/office/drawing/2010/main" val="0"/>
+                        </a:ext>
+                      </a:extLst>
+                    </a:blip>
+                    <a:srcRect/>
+                    <a:stretch>
+                      <a:fillRect/>
+                    </a:stretch>
+                  </pic:blipFill>
+                  <pic:spPr bwMode="auto">
+                    <a:xfrm>
+                      <a:off x="0" y="0"/>
+                      <a:ext cx="6154883" cy="3517257"/>
+                    </a:xfrm>
+                    <a:prstGeom prst="rect">
+                      <a:avLst/>
+                    </a:prstGeom>
+                    <a:noFill/>
+                    <a:ln>
+                      <a:noFill/>
+                    </a:ln>
+                  </pic:spPr>
+                </pic:pic>
+              </a:graphicData>
+            </a:graphic>
+          </wp:inline>
+        </w:drawing>
+      </w:r>
+    </w:p>
+    <w:p>
+      <w:pPr>
+        <w:rPr>
+          <w:lang w:val="pt-PT"/>
+        </w:rPr>
+      </w:pPr>
+    </w:p>
+    <w:p>
+      <w:pPr>
+        <w:rPr>
+          <w:lang w:val="pt-PT"/>
+        </w:rPr>
+      </w:pPr>
+      <w:r>
+        <w:rPr>
+          <w:noProof/>
+          <w:lang w:val="pt-PT"/>
+        </w:rPr>
+        <w:drawing>
+          <wp:inline distT="0" distB="0" distL="0" distR="0" wp14:anchorId="7A158853" wp14:editId="2E1E3808">
+            <wp:extent cx="6122670" cy="3498850"/>
+            <wp:effectExtent l="0" t="0" r="0" b="6350"/>
+            <wp:docPr id="1442529853" name="Picture 7"/>
+            <wp:cNvGraphicFramePr>
+              <a:graphicFrameLocks xmlns:a="http://schemas.openxmlformats.org/drawingml/2006/main" noChangeAspect="1"/>
+            </wp:cNvGraphicFramePr>
+            <a:graphic xmlns:a="http://schemas.openxmlformats.org/drawingml/2006/main">
+              <a:graphicData uri="http://schemas.openxmlformats.org/drawingml/2006/picture">
+                <pic:pic xmlns:pic="http://schemas.openxmlformats.org/drawingml/2006/picture">
+                  <pic:nvPicPr>
+                    <pic:cNvPr id="0" name="Picture 11"/>
+                    <pic:cNvPicPr>
+                      <a:picLocks noChangeAspect="1" noChangeArrowheads="1"/>
+                    </pic:cNvPicPr>
+                  </pic:nvPicPr>
+                  <pic:blipFill>
+                    <a:blip r:embed="rId10">
+                      <a:extLst>
+                        <a:ext uri="{28A0092B-C50C-407E-A947-70E740481C1C}">
+                          <a14:useLocalDpi xmlns:a14="http://schemas.microsoft.com/office/drawing/2010/main" val="0"/>
+                        </a:ext>
+                      </a:extLst>
+                    </a:blip>
+                    <a:srcRect/>
+                    <a:stretch>
+                      <a:fillRect/>
+                    </a:stretch>
+                  </pic:blipFill>
+                  <pic:spPr bwMode="auto">
+                    <a:xfrm>
+                      <a:off x="0" y="0"/>
+                      <a:ext cx="6122670" cy="3498850"/>
+                    </a:xfrm>
+                    <a:prstGeom prst="rect">
+                      <a:avLst/>
+                    </a:prstGeom>
+                    <a:noFill/>
+                    <a:ln>
+                      <a:noFill/>
+                    </a:ln>
+                  </pic:spPr>
+                </pic:pic>
+              </a:graphicData>
+            </a:graphic>
+          </wp:inline>
+        </w:drawing>
+      </w:r>
+    </w:p>
+    <w:p>
+      <w:pPr>
         <w:pStyle w:val="ListParagraph"/>
         <w:numPr>
           <w:ilvl w:val="0"/>
@@ -2335,6 +2728,75 @@
     </w:p>
     <w:p>
       <w:pPr>
+        <w:rPr>
+          <w:lang w:val="pt-PT"/>
+        </w:rPr>
+      </w:pPr>
+    </w:p>
+    <w:p>
+      <w:pPr>
+        <w:rPr>
+          <w:lang w:val="pt-PT"/>
+        </w:rPr>
+      </w:pPr>
+      <w:r>
+        <w:rPr>
+          <w:noProof/>
+          <w:lang w:val="pt-PT"/>
+        </w:rPr>
+        <w:lastRenderedPageBreak/>
+        <w:drawing>
+          <wp:inline distT="0" distB="0" distL="0" distR="0" wp14:anchorId="1E5F42FC" wp14:editId="2849D3E8">
+            <wp:extent cx="6122670" cy="3498850"/>
+            <wp:effectExtent l="0" t="0" r="0" b="6350"/>
+            <wp:docPr id="611587554" name="Picture 8"/>
+            <wp:cNvGraphicFramePr>
+              <a:graphicFrameLocks xmlns:a="http://schemas.openxmlformats.org/drawingml/2006/main" noChangeAspect="1"/>
+            </wp:cNvGraphicFramePr>
+            <a:graphic xmlns:a="http://schemas.openxmlformats.org/drawingml/2006/main">
+              <a:graphicData uri="http://schemas.openxmlformats.org/drawingml/2006/picture">
+                <pic:pic xmlns:pic="http://schemas.openxmlformats.org/drawingml/2006/picture">
+                  <pic:nvPicPr>
+                    <pic:cNvPr id="0" name="Picture 12"/>
+                    <pic:cNvPicPr>
+                      <a:picLocks noChangeAspect="1" noChangeArrowheads="1"/>
+                    </pic:cNvPicPr>
+                  </pic:nvPicPr>
+                  <pic:blipFill>
+                    <a:blip r:embed="rId11">
+                      <a:extLst>
+                        <a:ext uri="{28A0092B-C50C-407E-A947-70E740481C1C}">
+                          <a14:useLocalDpi xmlns:a14="http://schemas.microsoft.com/office/drawing/2010/main" val="0"/>
+                        </a:ext>
+                      </a:extLst>
+                    </a:blip>
+                    <a:srcRect/>
+                    <a:stretch>
+                      <a:fillRect/>
+                    </a:stretch>
+                  </pic:blipFill>
+                  <pic:spPr bwMode="auto">
+                    <a:xfrm>
+                      <a:off x="0" y="0"/>
+                      <a:ext cx="6122670" cy="3498850"/>
+                    </a:xfrm>
+                    <a:prstGeom prst="rect">
+                      <a:avLst/>
+                    </a:prstGeom>
+                    <a:noFill/>
+                    <a:ln>
+                      <a:noFill/>
+                    </a:ln>
+                  </pic:spPr>
+                </pic:pic>
+              </a:graphicData>
+            </a:graphic>
+          </wp:inline>
+        </w:drawing>
+      </w:r>
+    </w:p>
+    <w:p>
+      <w:pPr>
         <w:pStyle w:val="ListParagraph"/>
         <w:numPr>
           <w:ilvl w:val="0"/>
@@ -2349,82 +2811,150 @@
         <w:rPr>
           <w:lang w:val="pt-PT"/>
         </w:rPr>
+        <w:t>Erros totais</w:t>
+      </w:r>
+    </w:p>
+    <w:p>
+      <w:pPr>
+        <w:rPr>
+          <w:lang w:val="pt-PT"/>
+        </w:rPr>
+      </w:pPr>
+      <w:r>
+        <w:rPr>
+          <w:lang w:val="pt-PT"/>
+        </w:rPr>
+        <w:t>Verificou-se uma diferença estatisticamente significativa no número de erros, com o grupo dos 20–30 anos a apresentar mais erros do que o grupo dos 50–60 anos (p &lt; 0.001), sugerindo uma possível troca entre velocidade e precisão.</w:t>
+      </w:r>
+    </w:p>
+    <w:p>
+      <w:pPr>
+        <w:rPr>
+          <w:lang w:val="pt-PT"/>
+        </w:rPr>
+      </w:pPr>
+    </w:p>
+    <w:p>
+      <w:pPr>
+        <w:rPr>
+          <w:lang w:val="pt-PT"/>
+        </w:rPr>
+      </w:pPr>
+      <w:r>
+        <w:rPr>
+          <w:noProof/>
+          <w:lang w:val="pt-PT"/>
+        </w:rPr>
+        <w:drawing>
+          <wp:inline distT="0" distB="0" distL="0" distR="0" wp14:anchorId="7211950E" wp14:editId="59FD2094">
+            <wp:extent cx="6122670" cy="3498850"/>
+            <wp:effectExtent l="0" t="0" r="0" b="6350"/>
+            <wp:docPr id="693455541" name="Picture 9"/>
+            <wp:cNvGraphicFramePr>
+              <a:graphicFrameLocks xmlns:a="http://schemas.openxmlformats.org/drawingml/2006/main" noChangeAspect="1"/>
+            </wp:cNvGraphicFramePr>
+            <a:graphic xmlns:a="http://schemas.openxmlformats.org/drawingml/2006/main">
+              <a:graphicData uri="http://schemas.openxmlformats.org/drawingml/2006/picture">
+                <pic:pic xmlns:pic="http://schemas.openxmlformats.org/drawingml/2006/picture">
+                  <pic:nvPicPr>
+                    <pic:cNvPr id="0" name="Picture 13"/>
+                    <pic:cNvPicPr>
+                      <a:picLocks noChangeAspect="1" noChangeArrowheads="1"/>
+                    </pic:cNvPicPr>
+                  </pic:nvPicPr>
+                  <pic:blipFill>
+                    <a:blip r:embed="rId12">
+                      <a:extLst>
+                        <a:ext uri="{28A0092B-C50C-407E-A947-70E740481C1C}">
+                          <a14:useLocalDpi xmlns:a14="http://schemas.microsoft.com/office/drawing/2010/main" val="0"/>
+                        </a:ext>
+                      </a:extLst>
+                    </a:blip>
+                    <a:srcRect/>
+                    <a:stretch>
+                      <a:fillRect/>
+                    </a:stretch>
+                  </pic:blipFill>
+                  <pic:spPr bwMode="auto">
+                    <a:xfrm>
+                      <a:off x="0" y="0"/>
+                      <a:ext cx="6122670" cy="3498850"/>
+                    </a:xfrm>
+                    <a:prstGeom prst="rect">
+                      <a:avLst/>
+                    </a:prstGeom>
+                    <a:noFill/>
+                    <a:ln>
+                      <a:noFill/>
+                    </a:ln>
+                  </pic:spPr>
+                </pic:pic>
+              </a:graphicData>
+            </a:graphic>
+          </wp:inline>
+        </w:drawing>
+      </w:r>
+    </w:p>
+    <w:p>
+      <w:pPr>
+        <w:rPr>
+          <w:lang w:val="pt-PT"/>
+        </w:rPr>
+      </w:pPr>
+    </w:p>
+    <w:p>
+      <w:pPr>
+        <w:rPr>
+          <w:lang w:val="pt-PT"/>
+        </w:rPr>
+      </w:pPr>
+      <w:r>
+        <w:rPr>
+          <w:lang w:val="pt-PT"/>
+        </w:rPr>
+        <w:t xml:space="preserve">A análise gráfica (através de </w:t>
+      </w:r>
+      <w:proofErr w:type="spellStart"/>
+      <w:r>
+        <w:rPr>
+          <w:lang w:val="pt-PT"/>
+        </w:rPr>
+        <w:t>violin</w:t>
+      </w:r>
+      <w:proofErr w:type="spellEnd"/>
+      <w:r>
+        <w:rPr>
+          <w:lang w:val="pt-PT"/>
+        </w:rPr>
+        <w:t xml:space="preserve"> </w:t>
+      </w:r>
+      <w:proofErr w:type="spellStart"/>
+      <w:r>
+        <w:rPr>
+          <w:lang w:val="pt-PT"/>
+        </w:rPr>
+        <w:t>plots</w:t>
+      </w:r>
+      <w:proofErr w:type="spellEnd"/>
+      <w:r>
+        <w:rPr>
+          <w:lang w:val="pt-PT"/>
+        </w:rPr>
+        <w:t>) corrobora estes resultados, evidenciando distribuições de tempo mais concentradas e com menor dispersão nos participantes mais jovens.</w:t>
+      </w:r>
+    </w:p>
+    <w:p>
+      <w:pPr>
+        <w:pStyle w:val="Heading1"/>
+        <w:rPr>
+          <w:lang w:val="pt-PT"/>
+        </w:rPr>
+      </w:pPr>
+      <w:r>
+        <w:rPr>
+          <w:lang w:val="pt-PT"/>
+        </w:rPr>
         <w:lastRenderedPageBreak/>
-        <w:t>Erros totais</w:t>
-      </w:r>
-    </w:p>
-    <w:p>
-      <w:pPr>
-        <w:rPr>
-          <w:lang w:val="pt-PT"/>
-        </w:rPr>
-      </w:pPr>
-      <w:r>
-        <w:rPr>
-          <w:lang w:val="pt-PT"/>
-        </w:rPr>
-        <w:t>Verificou-se uma diferença estatisticamente significativa no número de erros, com o grupo dos 20–30 anos a apresentar mais erros do que o grupo dos 50–60 anos (p &lt; 0.001), sugerindo uma possível troca entre velocidade e precisão.</w:t>
-      </w:r>
-    </w:p>
-    <w:p>
-      <w:pPr>
-        <w:rPr>
-          <w:lang w:val="pt-PT"/>
-        </w:rPr>
-      </w:pPr>
-    </w:p>
-    <w:p>
-      <w:pPr>
-        <w:rPr>
-          <w:lang w:val="pt-PT"/>
-        </w:rPr>
-      </w:pPr>
-      <w:r>
-        <w:rPr>
-          <w:lang w:val="pt-PT"/>
-        </w:rPr>
-        <w:t xml:space="preserve">A análise gráfica (através de </w:t>
-      </w:r>
-      <w:proofErr w:type="spellStart"/>
-      <w:r>
-        <w:rPr>
-          <w:lang w:val="pt-PT"/>
-        </w:rPr>
-        <w:t>violin</w:t>
-      </w:r>
-      <w:proofErr w:type="spellEnd"/>
-      <w:r>
-        <w:rPr>
-          <w:lang w:val="pt-PT"/>
-        </w:rPr>
-        <w:t xml:space="preserve"> </w:t>
-      </w:r>
-      <w:proofErr w:type="spellStart"/>
-      <w:r>
-        <w:rPr>
-          <w:lang w:val="pt-PT"/>
-        </w:rPr>
-        <w:t>plots</w:t>
-      </w:r>
-      <w:proofErr w:type="spellEnd"/>
-      <w:r>
-        <w:rPr>
-          <w:lang w:val="pt-PT"/>
-        </w:rPr>
-        <w:t>) corrobora estes resultados, evidenciando distribuições de tempo mais concentradas e com menor dispersão nos participantes mais jovens.</w:t>
-      </w:r>
-    </w:p>
-    <w:p>
-      <w:pPr>
-        <w:pStyle w:val="Heading1"/>
-        <w:rPr>
-          <w:lang w:val="pt-PT"/>
-        </w:rPr>
-      </w:pPr>
-      <w:r>
-        <w:rPr>
-          <w:lang w:val="pt-PT"/>
-        </w:rPr>
         <w:t>Discussão</w:t>
       </w:r>
     </w:p>
@@ -2690,14 +3220,7 @@
         <w:rPr>
           <w:lang w:val="pt-PT"/>
         </w:rPr>
-        <w:t xml:space="preserve"> através de um conjunto de alterações simples, mas orientadas para problemas observados durante a interação dos utilizadores. As modificações introduzidas tiveram como objetivo reduzir a carga cognitiva, facilitar a identificação do alvo correto e tornar a interação mais rápida e controlada, sem comprometer a eficácia. Os resultados obtidos indicam que a solução proposta contribui para um melhor desempenho, refletido sobretudo na redução dos tempos de execução e numa maior </w:t>
-      </w:r>
-      <w:r>
-        <w:rPr>
-          <w:lang w:val="pt-PT"/>
-        </w:rPr>
-        <w:lastRenderedPageBreak/>
-        <w:t>consistência na seleção dos alvos. De forma geral, este projeto mostra que pequenas decisões de design, baseadas na observação do comportamento dos utilizadores e em princípios básicos de usabilidade, podem ter um impacto relevante na qualidade da interação.</w:t>
+        <w:t xml:space="preserve"> através de um conjunto de alterações simples, mas orientadas para problemas observados durante a interação dos utilizadores. As modificações introduzidas tiveram como objetivo reduzir a carga cognitiva, facilitar a identificação do alvo correto e tornar a interação mais rápida e controlada, sem comprometer a eficácia. Os resultados obtidos indicam que a solução proposta contribui para um melhor desempenho, refletido sobretudo na redução dos tempos de execução e numa maior consistência na seleção dos alvos. De forma geral, este projeto mostra que pequenas decisões de design, baseadas na observação do comportamento dos utilizadores e em princípios básicos de usabilidade, podem ter um impacto relevante na qualidade da interação.</w:t>
       </w:r>
     </w:p>
     <w:p>
@@ -2713,6 +3236,7 @@
         <w:rPr>
           <w:lang w:val="pt-PT"/>
         </w:rPr>
+        <w:lastRenderedPageBreak/>
         <w:t>Referências</w:t>
       </w:r>
     </w:p>
@@ -4187,6 +4711,7 @@
   <w:style w:type="character" w:default="1" w:styleId="DefaultParagraphFont">
     <w:name w:val="Default Paragraph Font"/>
     <w:uiPriority w:val="1"/>
+    <w:semiHidden/>
     <w:unhideWhenUsed/>
   </w:style>
   <w:style w:type="table" w:default="1" w:styleId="TableNormal">

</xml_diff>